<commit_message>
Add: core functionality, templates, database updates
</commit_message>
<xml_diff>
--- a/docs/Техническое задание.docx
+++ b/docs/Техническое задание.docx
@@ -1,6 +1,6 @@
 
 <file path=word/document.xml><?xml version="1.0" encoding="utf-8"?>
-<w:document xmlns:wpc="http://schemas.microsoft.com/office/word/2010/wordprocessingCanvas" xmlns:cx="http://schemas.microsoft.com/office/drawing/2014/chartex" xmlns:mc="http://schemas.openxmlformats.org/markup-compatibility/2006" xmlns:o="urn:schemas-microsoft-com:office:office" xmlns:r="http://schemas.openxmlformats.org/officeDocument/2006/relationships" xmlns:m="http://schemas.openxmlformats.org/officeDocument/2006/math" xmlns:v="urn:schemas-microsoft-com:vml" xmlns:wp14="http://schemas.microsoft.com/office/word/2010/wordprocessingDrawing" xmlns:wp="http://schemas.openxmlformats.org/drawingml/2006/wordprocessingDrawing" xmlns:w10="urn:schemas-microsoft-com:office:word" xmlns:w="http://schemas.openxmlformats.org/wordprocessingml/2006/main" xmlns:w14="http://schemas.microsoft.com/office/word/2010/wordml" xmlns:w15="http://schemas.microsoft.com/office/word/2012/wordml" xmlns:w16se="http://schemas.microsoft.com/office/word/2015/wordml/symex" xmlns:wpg="http://schemas.microsoft.com/office/word/2010/wordprocessingGroup" xmlns:wpi="http://schemas.microsoft.com/office/word/2010/wordprocessingInk" xmlns:wne="http://schemas.microsoft.com/office/word/2006/wordml" xmlns:wps="http://schemas.microsoft.com/office/word/2010/wordprocessingShape" mc:Ignorable="w14 w15 w16se wp14">
+<w:document xmlns:wpc="http://schemas.microsoft.com/office/word/2010/wordprocessingCanvas" xmlns:cx="http://schemas.microsoft.com/office/drawing/2014/chartex" xmlns:cx1="http://schemas.microsoft.com/office/drawing/2015/9/8/chartex" xmlns:cx2="http://schemas.microsoft.com/office/drawing/2015/10/21/chartex" xmlns:cx3="http://schemas.microsoft.com/office/drawing/2016/5/9/chartex" xmlns:cx4="http://schemas.microsoft.com/office/drawing/2016/5/10/chartex" xmlns:cx5="http://schemas.microsoft.com/office/drawing/2016/5/11/chartex" xmlns:cx6="http://schemas.microsoft.com/office/drawing/2016/5/12/chartex" xmlns:cx7="http://schemas.microsoft.com/office/drawing/2016/5/13/chartex" xmlns:cx8="http://schemas.microsoft.com/office/drawing/2016/5/14/chartex" xmlns:mc="http://schemas.openxmlformats.org/markup-compatibility/2006" xmlns:aink="http://schemas.microsoft.com/office/drawing/2016/ink" xmlns:am3d="http://schemas.microsoft.com/office/drawing/2017/model3d" xmlns:o="urn:schemas-microsoft-com:office:office" xmlns:r="http://schemas.openxmlformats.org/officeDocument/2006/relationships" xmlns:m="http://schemas.openxmlformats.org/officeDocument/2006/math" xmlns:v="urn:schemas-microsoft-com:vml" xmlns:wp14="http://schemas.microsoft.com/office/word/2010/wordprocessingDrawing" xmlns:wp="http://schemas.openxmlformats.org/drawingml/2006/wordprocessingDrawing" xmlns:w10="urn:schemas-microsoft-com:office:word" xmlns:w="http://schemas.openxmlformats.org/wordprocessingml/2006/main" xmlns:w14="http://schemas.microsoft.com/office/word/2010/wordml" xmlns:w15="http://schemas.microsoft.com/office/word/2012/wordml" xmlns:w16cex="http://schemas.microsoft.com/office/word/2018/wordml/cex" xmlns:w16cid="http://schemas.microsoft.com/office/word/2016/wordml/cid" xmlns:w16="http://schemas.microsoft.com/office/word/2018/wordml" xmlns:w16sdtdh="http://schemas.microsoft.com/office/word/2020/wordml/sdtdatahash" xmlns:w16se="http://schemas.microsoft.com/office/word/2015/wordml/symex" xmlns:wpg="http://schemas.microsoft.com/office/word/2010/wordprocessingGroup" xmlns:wpi="http://schemas.microsoft.com/office/word/2010/wordprocessingInk" xmlns:wne="http://schemas.microsoft.com/office/word/2006/wordml" xmlns:wps="http://schemas.microsoft.com/office/word/2010/wordprocessingShape" mc:Ignorable="w14 w15 w16se w16cid w16 w16cex w16sdtdh wp14">
   <w:body>
     <w:p>
       <w:pPr>
@@ -3827,21 +3827,28 @@
           <w:b/>
           <w:sz w:val="24"/>
         </w:rPr>
-        <w:t>Характеристики недвижимости</w:t>
-      </w:r>
-      <w:r>
-        <w:rPr>
-          <w:rFonts w:ascii="Times New Roman" w:hAnsi="Times New Roman" w:cs="Times New Roman"/>
-          <w:sz w:val="24"/>
-        </w:rPr>
-        <w:t xml:space="preserve">: </w:t>
-      </w:r>
-      <w:r>
-        <w:rPr>
-          <w:rFonts w:ascii="Times New Roman" w:hAnsi="Times New Roman" w:cs="Times New Roman"/>
-          <w:sz w:val="24"/>
-        </w:rPr>
-        <w:t>Используется для удобства и распределения</w:t>
+        <w:t>Фотографии объектов:</w:t>
+      </w:r>
+      <w:r>
+        <w:rPr>
+          <w:rFonts w:ascii="Times New Roman" w:hAnsi="Times New Roman" w:cs="Times New Roman"/>
+          <w:sz w:val="24"/>
+        </w:rPr>
+        <w:t xml:space="preserve"> </w:t>
+      </w:r>
+      <w:r>
+        <w:rPr>
+          <w:rFonts w:ascii="Times New Roman" w:hAnsi="Times New Roman" w:cs="Times New Roman"/>
+          <w:sz w:val="24"/>
+        </w:rPr>
+        <w:t>Предназначены</w:t>
+      </w:r>
+      <w:r>
+        <w:rPr>
+          <w:rFonts w:ascii="Times New Roman" w:hAnsi="Times New Roman" w:cs="Times New Roman"/>
+          <w:sz w:val="24"/>
+        </w:rPr>
+        <w:t xml:space="preserve"> для хранения фотографий какого-либо объекта</w:t>
       </w:r>
     </w:p>
     <w:p>
@@ -3852,8 +3859,12 @@
           <w:numId w:val="45"/>
         </w:numPr>
         <w:rPr>
-          <w:rFonts w:ascii="Times New Roman" w:hAnsi="Times New Roman" w:cs="Times New Roman"/>
-          <w:sz w:val="24"/>
+          <w:rStyle w:val="ab"/>
+          <w:rFonts w:ascii="Times New Roman" w:hAnsi="Times New Roman" w:cs="Times New Roman"/>
+          <w:i w:val="0"/>
+          <w:iCs w:val="0"/>
+          <w:sz w:val="24"/>
+          <w:szCs w:val="24"/>
         </w:rPr>
       </w:pPr>
       <w:r>
@@ -3861,29 +3872,29 @@
           <w:rFonts w:ascii="Times New Roman" w:hAnsi="Times New Roman" w:cs="Times New Roman"/>
           <w:b/>
           <w:sz w:val="24"/>
-        </w:rPr>
-        <w:t>Фотографии объектов:</w:t>
-      </w:r>
-      <w:r>
-        <w:rPr>
-          <w:rFonts w:ascii="Times New Roman" w:hAnsi="Times New Roman" w:cs="Times New Roman"/>
-          <w:sz w:val="24"/>
-        </w:rPr>
-        <w:t xml:space="preserve"> </w:t>
-      </w:r>
-      <w:r>
-        <w:rPr>
-          <w:rFonts w:ascii="Times New Roman" w:hAnsi="Times New Roman" w:cs="Times New Roman"/>
-          <w:sz w:val="24"/>
-        </w:rPr>
-        <w:t>Предназначены</w:t>
-      </w:r>
-      <w:r>
-        <w:rPr>
-          <w:rFonts w:ascii="Times New Roman" w:hAnsi="Times New Roman" w:cs="Times New Roman"/>
-          <w:sz w:val="24"/>
-        </w:rPr>
-        <w:t xml:space="preserve"> для хранения фотографий какого-либо объекта</w:t>
+          <w:szCs w:val="24"/>
+        </w:rPr>
+        <w:t>Заявки</w:t>
+      </w:r>
+      <w:r>
+        <w:rPr>
+          <w:rFonts w:ascii="Times New Roman" w:hAnsi="Times New Roman" w:cs="Times New Roman"/>
+          <w:sz w:val="24"/>
+          <w:szCs w:val="24"/>
+        </w:rPr>
+        <w:t xml:space="preserve">: </w:t>
+      </w:r>
+      <w:r>
+        <w:rPr>
+          <w:rStyle w:val="ab"/>
+          <w:rFonts w:ascii="Times New Roman" w:hAnsi="Times New Roman" w:cs="Times New Roman"/>
+          <w:i w:val="0"/>
+          <w:color w:val="0F1115"/>
+          <w:sz w:val="24"/>
+          <w:szCs w:val="24"/>
+          <w:shd w:val="clear" w:color="auto" w:fill="FFFFFF"/>
+        </w:rPr>
+        <w:t>Отражает процесс подачи и обработки заявок на аренду объектов.</w:t>
       </w:r>
     </w:p>
     <w:p>
@@ -3904,32 +3915,28 @@
       </w:pPr>
       <w:r>
         <w:rPr>
+          <w:rStyle w:val="ab"/>
           <w:rFonts w:ascii="Times New Roman" w:hAnsi="Times New Roman" w:cs="Times New Roman"/>
           <w:b/>
-          <w:sz w:val="24"/>
-          <w:szCs w:val="24"/>
-        </w:rPr>
-        <w:t>Заявки</w:t>
-      </w:r>
-      <w:r>
-        <w:rPr>
-          <w:rFonts w:ascii="Times New Roman" w:hAnsi="Times New Roman" w:cs="Times New Roman"/>
-          <w:sz w:val="24"/>
-          <w:szCs w:val="24"/>
-        </w:rPr>
-        <w:t xml:space="preserve">: </w:t>
-      </w:r>
-      <w:r>
-        <w:rPr>
-          <w:rStyle w:val="ab"/>
-          <w:rFonts w:ascii="Times New Roman" w:hAnsi="Times New Roman" w:cs="Times New Roman"/>
           <w:i w:val="0"/>
           <w:color w:val="0F1115"/>
           <w:sz w:val="24"/>
           <w:szCs w:val="24"/>
           <w:shd w:val="clear" w:color="auto" w:fill="FFFFFF"/>
         </w:rPr>
-        <w:t>Отражает процесс подачи и обработки заявок на аренду объектов.</w:t>
+        <w:t>Договоры аренды</w:t>
+      </w:r>
+      <w:r>
+        <w:rPr>
+          <w:rStyle w:val="ab"/>
+          <w:rFonts w:ascii="Times New Roman" w:hAnsi="Times New Roman" w:cs="Times New Roman"/>
+          <w:i w:val="0"/>
+          <w:color w:val="0F1115"/>
+          <w:sz w:val="24"/>
+          <w:szCs w:val="24"/>
+          <w:shd w:val="clear" w:color="auto" w:fill="FFFFFF"/>
+        </w:rPr>
+        <w:t>: Хранит информацию о заключенных договорах аренды.</w:t>
       </w:r>
     </w:p>
     <w:p>
@@ -3950,28 +3957,26 @@
       </w:pPr>
       <w:r>
         <w:rPr>
+          <w:rStyle w:val="a8"/>
+          <w:rFonts w:ascii="Times New Roman" w:hAnsi="Times New Roman" w:cs="Times New Roman"/>
+          <w:color w:val="0F1115"/>
+          <w:sz w:val="24"/>
+          <w:szCs w:val="24"/>
+          <w:shd w:val="clear" w:color="auto" w:fill="FFFFFF"/>
+        </w:rPr>
+        <w:t xml:space="preserve">Коммуникации: </w:t>
+      </w:r>
+      <w:r>
+        <w:rPr>
           <w:rStyle w:val="ab"/>
           <w:rFonts w:ascii="Times New Roman" w:hAnsi="Times New Roman" w:cs="Times New Roman"/>
-          <w:b/>
           <w:i w:val="0"/>
           <w:color w:val="0F1115"/>
           <w:sz w:val="24"/>
           <w:szCs w:val="24"/>
           <w:shd w:val="clear" w:color="auto" w:fill="FFFFFF"/>
         </w:rPr>
-        <w:t>Договоры аренды</w:t>
-      </w:r>
-      <w:r>
-        <w:rPr>
-          <w:rStyle w:val="ab"/>
-          <w:rFonts w:ascii="Times New Roman" w:hAnsi="Times New Roman" w:cs="Times New Roman"/>
-          <w:i w:val="0"/>
-          <w:color w:val="0F1115"/>
-          <w:sz w:val="24"/>
-          <w:szCs w:val="24"/>
-          <w:shd w:val="clear" w:color="auto" w:fill="FFFFFF"/>
-        </w:rPr>
-        <w:t>: Хранит информацию о заключенных договорах аренды.</w:t>
+        <w:t>Объединяет все виды сообщений: переписки, уведомления, системные алерты.</w:t>
       </w:r>
     </w:p>
     <w:p>
@@ -3999,86 +4004,6 @@
           <w:szCs w:val="24"/>
           <w:shd w:val="clear" w:color="auto" w:fill="FFFFFF"/>
         </w:rPr>
-        <w:t xml:space="preserve">Коммуникации: </w:t>
-      </w:r>
-      <w:r>
-        <w:rPr>
-          <w:rStyle w:val="ab"/>
-          <w:rFonts w:ascii="Times New Roman" w:hAnsi="Times New Roman" w:cs="Times New Roman"/>
-          <w:i w:val="0"/>
-          <w:color w:val="0F1115"/>
-          <w:sz w:val="24"/>
-          <w:szCs w:val="24"/>
-          <w:shd w:val="clear" w:color="auto" w:fill="FFFFFF"/>
-        </w:rPr>
-        <w:t>Объединяет все виды сообщений: переписки, уведомления, системные алерты.</w:t>
-      </w:r>
-    </w:p>
-    <w:p>
-      <w:pPr>
-        <w:pStyle w:val="a3"/>
-        <w:numPr>
-          <w:ilvl w:val="0"/>
-          <w:numId w:val="45"/>
-        </w:numPr>
-        <w:rPr>
-          <w:rStyle w:val="ab"/>
-          <w:rFonts w:ascii="Times New Roman" w:hAnsi="Times New Roman" w:cs="Times New Roman"/>
-          <w:i w:val="0"/>
-          <w:iCs w:val="0"/>
-          <w:sz w:val="24"/>
-          <w:szCs w:val="24"/>
-        </w:rPr>
-      </w:pPr>
-      <w:r>
-        <w:rPr>
-          <w:rStyle w:val="a8"/>
-          <w:rFonts w:ascii="Times New Roman" w:hAnsi="Times New Roman" w:cs="Times New Roman"/>
-          <w:color w:val="0F1115"/>
-          <w:sz w:val="24"/>
-          <w:szCs w:val="24"/>
-          <w:shd w:val="clear" w:color="auto" w:fill="FFFFFF"/>
-        </w:rPr>
-        <w:t xml:space="preserve">Сохраненные поиски: </w:t>
-      </w:r>
-      <w:r>
-        <w:rPr>
-          <w:rStyle w:val="ab"/>
-          <w:rFonts w:ascii="Times New Roman" w:hAnsi="Times New Roman" w:cs="Times New Roman"/>
-          <w:i w:val="0"/>
-          <w:color w:val="0F1115"/>
-          <w:sz w:val="24"/>
-          <w:szCs w:val="24"/>
-          <w:shd w:val="clear" w:color="auto" w:fill="FFFFFF"/>
-        </w:rPr>
-        <w:t>Позволяет пользователям сохранять параметры поиска для повторного использования.</w:t>
-      </w:r>
-    </w:p>
-    <w:p>
-      <w:pPr>
-        <w:pStyle w:val="a3"/>
-        <w:numPr>
-          <w:ilvl w:val="0"/>
-          <w:numId w:val="45"/>
-        </w:numPr>
-        <w:rPr>
-          <w:rStyle w:val="ab"/>
-          <w:rFonts w:ascii="Times New Roman" w:hAnsi="Times New Roman" w:cs="Times New Roman"/>
-          <w:i w:val="0"/>
-          <w:iCs w:val="0"/>
-          <w:sz w:val="24"/>
-          <w:szCs w:val="24"/>
-        </w:rPr>
-      </w:pPr>
-      <w:r>
-        <w:rPr>
-          <w:rStyle w:val="a8"/>
-          <w:rFonts w:ascii="Times New Roman" w:hAnsi="Times New Roman" w:cs="Times New Roman"/>
-          <w:color w:val="0F1115"/>
-          <w:sz w:val="24"/>
-          <w:szCs w:val="24"/>
-          <w:shd w:val="clear" w:color="auto" w:fill="FFFFFF"/>
-        </w:rPr>
         <w:t xml:space="preserve">Логи действий: </w:t>
       </w:r>
       <w:r>
@@ -4165,7 +4090,6 @@
           <w:b/>
           <w:sz w:val="24"/>
         </w:rPr>
-        <w:lastRenderedPageBreak/>
         <w:t>Объекты → Дополнительные данные</w:t>
       </w:r>
       <w:r>
@@ -4222,6 +4146,7 @@
           <w:b/>
           <w:sz w:val="24"/>
         </w:rPr>
+        <w:lastRenderedPageBreak/>
         <w:t>Коммуникационная сеть</w:t>
       </w:r>
       <w:r>
@@ -4229,7 +4154,7 @@
           <w:rFonts w:ascii="Times New Roman" w:hAnsi="Times New Roman" w:cs="Times New Roman"/>
           <w:sz w:val="24"/>
         </w:rPr>
-        <w:t>: Пользователи могут обмениваться сообщениями через таблицу коммуникации, а коммуникации могут быть привязаны к любым сущностям (объектам, заявкам, договорам)</w:t>
+        <w:t>: Пользователи могут обмениваться сообщениями через таблицу коммуникации</w:t>
       </w:r>
     </w:p>
     <w:p>
@@ -4257,14 +4182,14 @@
           <w:rFonts w:ascii="Times New Roman" w:hAnsi="Times New Roman" w:cs="Times New Roman"/>
           <w:sz w:val="24"/>
         </w:rPr>
-        <w:t>: Пользователи могут сохранять поисковые запросы</w:t>
-      </w:r>
-      <w:r>
-        <w:rPr>
-          <w:rFonts w:ascii="Times New Roman" w:hAnsi="Times New Roman" w:cs="Times New Roman"/>
-          <w:sz w:val="24"/>
-        </w:rPr>
-        <w:t>. Все действия пользователей фиксируются в таблице логов.</w:t>
+        <w:t xml:space="preserve">: </w:t>
+      </w:r>
+      <w:r>
+        <w:rPr>
+          <w:rFonts w:ascii="Times New Roman" w:hAnsi="Times New Roman" w:cs="Times New Roman"/>
+          <w:sz w:val="24"/>
+        </w:rPr>
+        <w:t>Все действия пользователей фиксируются в таблице логов.</w:t>
       </w:r>
     </w:p>
     <w:p>
@@ -4500,10 +4425,10 @@
           <w:sz w:val="24"/>
         </w:rPr>
       </w:pPr>
-      <w:bookmarkStart w:id="0" w:name="_GoBack"/>
-      <w:r>
-        <w:rPr>
-          <w:rFonts w:ascii="Times New Roman" w:hAnsi="Times New Roman" w:cs="Times New Roman"/>
+      <w:r>
+        <w:rPr>
+          <w:rFonts w:ascii="Times New Roman" w:hAnsi="Times New Roman" w:cs="Times New Roman"/>
+          <w:noProof/>
           <w:sz w:val="24"/>
         </w:rPr>
         <w:drawing>
@@ -4542,7 +4467,6 @@
           </wp:inline>
         </w:drawing>
       </w:r>
-      <w:bookmarkEnd w:id="0"/>
     </w:p>
     <w:p>
       <w:pPr>
@@ -4608,7 +4532,7 @@
 </file>
 
 <file path=word/endnotes.xml><?xml version="1.0" encoding="utf-8"?>
-<w:endnotes xmlns:wpc="http://schemas.microsoft.com/office/word/2010/wordprocessingCanvas" xmlns:cx="http://schemas.microsoft.com/office/drawing/2014/chartex" xmlns:mc="http://schemas.openxmlformats.org/markup-compatibility/2006" xmlns:o="urn:schemas-microsoft-com:office:office" xmlns:r="http://schemas.openxmlformats.org/officeDocument/2006/relationships" xmlns:m="http://schemas.openxmlformats.org/officeDocument/2006/math" xmlns:v="urn:schemas-microsoft-com:vml" xmlns:wp14="http://schemas.microsoft.com/office/word/2010/wordprocessingDrawing" xmlns:wp="http://schemas.openxmlformats.org/drawingml/2006/wordprocessingDrawing" xmlns:w10="urn:schemas-microsoft-com:office:word" xmlns:w="http://schemas.openxmlformats.org/wordprocessingml/2006/main" xmlns:w14="http://schemas.microsoft.com/office/word/2010/wordml" xmlns:w15="http://schemas.microsoft.com/office/word/2012/wordml" xmlns:w16se="http://schemas.microsoft.com/office/word/2015/wordml/symex" xmlns:wpg="http://schemas.microsoft.com/office/word/2010/wordprocessingGroup" xmlns:wpi="http://schemas.microsoft.com/office/word/2010/wordprocessingInk" xmlns:wne="http://schemas.microsoft.com/office/word/2006/wordml" xmlns:wps="http://schemas.microsoft.com/office/word/2010/wordprocessingShape" mc:Ignorable="w14 w15 w16se wp14">
+<w:endnotes xmlns:wpc="http://schemas.microsoft.com/office/word/2010/wordprocessingCanvas" xmlns:cx="http://schemas.microsoft.com/office/drawing/2014/chartex" xmlns:cx1="http://schemas.microsoft.com/office/drawing/2015/9/8/chartex" xmlns:cx2="http://schemas.microsoft.com/office/drawing/2015/10/21/chartex" xmlns:cx3="http://schemas.microsoft.com/office/drawing/2016/5/9/chartex" xmlns:cx4="http://schemas.microsoft.com/office/drawing/2016/5/10/chartex" xmlns:cx5="http://schemas.microsoft.com/office/drawing/2016/5/11/chartex" xmlns:cx6="http://schemas.microsoft.com/office/drawing/2016/5/12/chartex" xmlns:cx7="http://schemas.microsoft.com/office/drawing/2016/5/13/chartex" xmlns:cx8="http://schemas.microsoft.com/office/drawing/2016/5/14/chartex" xmlns:mc="http://schemas.openxmlformats.org/markup-compatibility/2006" xmlns:aink="http://schemas.microsoft.com/office/drawing/2016/ink" xmlns:am3d="http://schemas.microsoft.com/office/drawing/2017/model3d" xmlns:o="urn:schemas-microsoft-com:office:office" xmlns:r="http://schemas.openxmlformats.org/officeDocument/2006/relationships" xmlns:m="http://schemas.openxmlformats.org/officeDocument/2006/math" xmlns:v="urn:schemas-microsoft-com:vml" xmlns:wp14="http://schemas.microsoft.com/office/word/2010/wordprocessingDrawing" xmlns:wp="http://schemas.openxmlformats.org/drawingml/2006/wordprocessingDrawing" xmlns:w10="urn:schemas-microsoft-com:office:word" xmlns:w="http://schemas.openxmlformats.org/wordprocessingml/2006/main" xmlns:w14="http://schemas.microsoft.com/office/word/2010/wordml" xmlns:w15="http://schemas.microsoft.com/office/word/2012/wordml" xmlns:w16cex="http://schemas.microsoft.com/office/word/2018/wordml/cex" xmlns:w16cid="http://schemas.microsoft.com/office/word/2016/wordml/cid" xmlns:w16="http://schemas.microsoft.com/office/word/2018/wordml" xmlns:w16sdtdh="http://schemas.microsoft.com/office/word/2020/wordml/sdtdatahash" xmlns:w16se="http://schemas.microsoft.com/office/word/2015/wordml/symex" xmlns:wpg="http://schemas.microsoft.com/office/word/2010/wordprocessingGroup" xmlns:wpi="http://schemas.microsoft.com/office/word/2010/wordprocessingInk" xmlns:wne="http://schemas.microsoft.com/office/word/2006/wordml" xmlns:wps="http://schemas.microsoft.com/office/word/2010/wordprocessingShape" mc:Ignorable="w14 w15 w16se w16cid w16 w16cex w16sdtdh wp14">
   <w:endnote w:type="separator" w:id="-1">
     <w:p>
       <w:pPr>
@@ -4633,7 +4557,7 @@
 </file>
 
 <file path=word/footnotes.xml><?xml version="1.0" encoding="utf-8"?>
-<w:footnotes xmlns:wpc="http://schemas.microsoft.com/office/word/2010/wordprocessingCanvas" xmlns:cx="http://schemas.microsoft.com/office/drawing/2014/chartex" xmlns:mc="http://schemas.openxmlformats.org/markup-compatibility/2006" xmlns:o="urn:schemas-microsoft-com:office:office" xmlns:r="http://schemas.openxmlformats.org/officeDocument/2006/relationships" xmlns:m="http://schemas.openxmlformats.org/officeDocument/2006/math" xmlns:v="urn:schemas-microsoft-com:vml" xmlns:wp14="http://schemas.microsoft.com/office/word/2010/wordprocessingDrawing" xmlns:wp="http://schemas.openxmlformats.org/drawingml/2006/wordprocessingDrawing" xmlns:w10="urn:schemas-microsoft-com:office:word" xmlns:w="http://schemas.openxmlformats.org/wordprocessingml/2006/main" xmlns:w14="http://schemas.microsoft.com/office/word/2010/wordml" xmlns:w15="http://schemas.microsoft.com/office/word/2012/wordml" xmlns:w16se="http://schemas.microsoft.com/office/word/2015/wordml/symex" xmlns:wpg="http://schemas.microsoft.com/office/word/2010/wordprocessingGroup" xmlns:wpi="http://schemas.microsoft.com/office/word/2010/wordprocessingInk" xmlns:wne="http://schemas.microsoft.com/office/word/2006/wordml" xmlns:wps="http://schemas.microsoft.com/office/word/2010/wordprocessingShape" mc:Ignorable="w14 w15 w16se wp14">
+<w:footnotes xmlns:wpc="http://schemas.microsoft.com/office/word/2010/wordprocessingCanvas" xmlns:cx="http://schemas.microsoft.com/office/drawing/2014/chartex" xmlns:cx1="http://schemas.microsoft.com/office/drawing/2015/9/8/chartex" xmlns:cx2="http://schemas.microsoft.com/office/drawing/2015/10/21/chartex" xmlns:cx3="http://schemas.microsoft.com/office/drawing/2016/5/9/chartex" xmlns:cx4="http://schemas.microsoft.com/office/drawing/2016/5/10/chartex" xmlns:cx5="http://schemas.microsoft.com/office/drawing/2016/5/11/chartex" xmlns:cx6="http://schemas.microsoft.com/office/drawing/2016/5/12/chartex" xmlns:cx7="http://schemas.microsoft.com/office/drawing/2016/5/13/chartex" xmlns:cx8="http://schemas.microsoft.com/office/drawing/2016/5/14/chartex" xmlns:mc="http://schemas.openxmlformats.org/markup-compatibility/2006" xmlns:aink="http://schemas.microsoft.com/office/drawing/2016/ink" xmlns:am3d="http://schemas.microsoft.com/office/drawing/2017/model3d" xmlns:o="urn:schemas-microsoft-com:office:office" xmlns:r="http://schemas.openxmlformats.org/officeDocument/2006/relationships" xmlns:m="http://schemas.openxmlformats.org/officeDocument/2006/math" xmlns:v="urn:schemas-microsoft-com:vml" xmlns:wp14="http://schemas.microsoft.com/office/word/2010/wordprocessingDrawing" xmlns:wp="http://schemas.openxmlformats.org/drawingml/2006/wordprocessingDrawing" xmlns:w10="urn:schemas-microsoft-com:office:word" xmlns:w="http://schemas.openxmlformats.org/wordprocessingml/2006/main" xmlns:w14="http://schemas.microsoft.com/office/word/2010/wordml" xmlns:w15="http://schemas.microsoft.com/office/word/2012/wordml" xmlns:w16cex="http://schemas.microsoft.com/office/word/2018/wordml/cex" xmlns:w16cid="http://schemas.microsoft.com/office/word/2016/wordml/cid" xmlns:w16="http://schemas.microsoft.com/office/word/2018/wordml" xmlns:w16sdtdh="http://schemas.microsoft.com/office/word/2020/wordml/sdtdatahash" xmlns:w16se="http://schemas.microsoft.com/office/word/2015/wordml/symex" xmlns:wpg="http://schemas.microsoft.com/office/word/2010/wordprocessingGroup" xmlns:wpi="http://schemas.microsoft.com/office/word/2010/wordprocessingInk" xmlns:wne="http://schemas.microsoft.com/office/word/2006/wordml" xmlns:wps="http://schemas.microsoft.com/office/word/2010/wordprocessingShape" mc:Ignorable="w14 w15 w16se w16cid w16 w16cex w16sdtdh wp14">
   <w:footnote w:type="separator" w:id="-1">
     <w:p>
       <w:pPr>
@@ -4658,7 +4582,7 @@
 </file>
 
 <file path=word/numbering.xml><?xml version="1.0" encoding="utf-8"?>
-<w:numbering xmlns:wpc="http://schemas.microsoft.com/office/word/2010/wordprocessingCanvas" xmlns:cx="http://schemas.microsoft.com/office/drawing/2014/chartex" xmlns:mc="http://schemas.openxmlformats.org/markup-compatibility/2006" xmlns:o="urn:schemas-microsoft-com:office:office" xmlns:r="http://schemas.openxmlformats.org/officeDocument/2006/relationships" xmlns:m="http://schemas.openxmlformats.org/officeDocument/2006/math" xmlns:v="urn:schemas-microsoft-com:vml" xmlns:wp14="http://schemas.microsoft.com/office/word/2010/wordprocessingDrawing" xmlns:wp="http://schemas.openxmlformats.org/drawingml/2006/wordprocessingDrawing" xmlns:w10="urn:schemas-microsoft-com:office:word" xmlns:w="http://schemas.openxmlformats.org/wordprocessingml/2006/main" xmlns:w14="http://schemas.microsoft.com/office/word/2010/wordml" xmlns:w15="http://schemas.microsoft.com/office/word/2012/wordml" xmlns:w16se="http://schemas.microsoft.com/office/word/2015/wordml/symex" xmlns:wpg="http://schemas.microsoft.com/office/word/2010/wordprocessingGroup" xmlns:wpi="http://schemas.microsoft.com/office/word/2010/wordprocessingInk" xmlns:wne="http://schemas.microsoft.com/office/word/2006/wordml" xmlns:wps="http://schemas.microsoft.com/office/word/2010/wordprocessingShape" mc:Ignorable="w14 w15 w16se wp14">
+<w:numbering xmlns:wpc="http://schemas.microsoft.com/office/word/2010/wordprocessingCanvas" xmlns:cx="http://schemas.microsoft.com/office/drawing/2014/chartex" xmlns:cx1="http://schemas.microsoft.com/office/drawing/2015/9/8/chartex" xmlns:cx2="http://schemas.microsoft.com/office/drawing/2015/10/21/chartex" xmlns:cx3="http://schemas.microsoft.com/office/drawing/2016/5/9/chartex" xmlns:cx4="http://schemas.microsoft.com/office/drawing/2016/5/10/chartex" xmlns:cx5="http://schemas.microsoft.com/office/drawing/2016/5/11/chartex" xmlns:cx6="http://schemas.microsoft.com/office/drawing/2016/5/12/chartex" xmlns:cx7="http://schemas.microsoft.com/office/drawing/2016/5/13/chartex" xmlns:cx8="http://schemas.microsoft.com/office/drawing/2016/5/14/chartex" xmlns:mc="http://schemas.openxmlformats.org/markup-compatibility/2006" xmlns:aink="http://schemas.microsoft.com/office/drawing/2016/ink" xmlns:am3d="http://schemas.microsoft.com/office/drawing/2017/model3d" xmlns:o="urn:schemas-microsoft-com:office:office" xmlns:r="http://schemas.openxmlformats.org/officeDocument/2006/relationships" xmlns:m="http://schemas.openxmlformats.org/officeDocument/2006/math" xmlns:v="urn:schemas-microsoft-com:vml" xmlns:wp14="http://schemas.microsoft.com/office/word/2010/wordprocessingDrawing" xmlns:wp="http://schemas.openxmlformats.org/drawingml/2006/wordprocessingDrawing" xmlns:w10="urn:schemas-microsoft-com:office:word" xmlns:w="http://schemas.openxmlformats.org/wordprocessingml/2006/main" xmlns:w14="http://schemas.microsoft.com/office/word/2010/wordml" xmlns:w15="http://schemas.microsoft.com/office/word/2012/wordml" xmlns:w16cex="http://schemas.microsoft.com/office/word/2018/wordml/cex" xmlns:w16cid="http://schemas.microsoft.com/office/word/2016/wordml/cid" xmlns:w16="http://schemas.microsoft.com/office/word/2018/wordml" xmlns:w16sdtdh="http://schemas.microsoft.com/office/word/2020/wordml/sdtdatahash" xmlns:w16se="http://schemas.microsoft.com/office/word/2015/wordml/symex" xmlns:wpg="http://schemas.microsoft.com/office/word/2010/wordprocessingGroup" xmlns:wpi="http://schemas.microsoft.com/office/word/2010/wordprocessingInk" xmlns:wne="http://schemas.microsoft.com/office/word/2006/wordml" xmlns:wps="http://schemas.microsoft.com/office/word/2010/wordprocessingShape" mc:Ignorable="w14 w15 w16se w16cid w16 w16cex w16sdtdh wp14">
   <w:abstractNum w:abstractNumId="0" w15:restartNumberingAfterBreak="0">
     <w:nsid w:val="01E5558F"/>
     <w:multiLevelType w:val="multilevel"/>
@@ -10772,7 +10696,7 @@
 </file>
 
 <file path=word/styles.xml><?xml version="1.0" encoding="utf-8"?>
-<w:styles xmlns:mc="http://schemas.openxmlformats.org/markup-compatibility/2006" xmlns:r="http://schemas.openxmlformats.org/officeDocument/2006/relationships" xmlns:w="http://schemas.openxmlformats.org/wordprocessingml/2006/main" xmlns:w14="http://schemas.microsoft.com/office/word/2010/wordml" xmlns:w15="http://schemas.microsoft.com/office/word/2012/wordml" xmlns:w16se="http://schemas.microsoft.com/office/word/2015/wordml/symex" mc:Ignorable="w14 w15 w16se">
+<w:styles xmlns:mc="http://schemas.openxmlformats.org/markup-compatibility/2006" xmlns:r="http://schemas.openxmlformats.org/officeDocument/2006/relationships" xmlns:w="http://schemas.openxmlformats.org/wordprocessingml/2006/main" xmlns:w14="http://schemas.microsoft.com/office/word/2010/wordml" xmlns:w15="http://schemas.microsoft.com/office/word/2012/wordml" xmlns:w16cex="http://schemas.microsoft.com/office/word/2018/wordml/cex" xmlns:w16cid="http://schemas.microsoft.com/office/word/2016/wordml/cid" xmlns:w16="http://schemas.microsoft.com/office/word/2018/wordml" xmlns:w16sdtdh="http://schemas.microsoft.com/office/word/2020/wordml/sdtdatahash" xmlns:w16se="http://schemas.microsoft.com/office/word/2015/wordml/symex" mc:Ignorable="w14 w15 w16se w16cid w16 w16cex w16sdtdh">
   <w:docDefaults>
     <w:rPrDefault>
       <w:rPr>
@@ -10788,7 +10712,7 @@
       </w:pPr>
     </w:pPrDefault>
   </w:docDefaults>
-  <w:latentStyles w:defLockedState="0" w:defUIPriority="99" w:defSemiHidden="0" w:defUnhideWhenUsed="0" w:defQFormat="0" w:count="371">
+  <w:latentStyles w:defLockedState="0" w:defUIPriority="99" w:defSemiHidden="0" w:defUnhideWhenUsed="0" w:defQFormat="0" w:count="376">
     <w:lsdException w:name="Normal" w:uiPriority="0" w:qFormat="1"/>
     <w:lsdException w:name="heading 1" w:uiPriority="9" w:qFormat="1"/>
     <w:lsdException w:name="heading 2" w:semiHidden="1" w:uiPriority="9" w:unhideWhenUsed="1" w:qFormat="1"/>
@@ -10894,7 +10818,6 @@
     <w:lsdException w:name="HTML Sample" w:semiHidden="1" w:unhideWhenUsed="1"/>
     <w:lsdException w:name="HTML Typewriter" w:semiHidden="1" w:unhideWhenUsed="1"/>
     <w:lsdException w:name="HTML Variable" w:semiHidden="1" w:unhideWhenUsed="1"/>
-    <w:lsdException w:name="Normal Table" w:semiHidden="1" w:unhideWhenUsed="1"/>
     <w:lsdException w:name="annotation subject" w:semiHidden="1" w:unhideWhenUsed="1"/>
     <w:lsdException w:name="No List" w:semiHidden="1" w:unhideWhenUsed="1"/>
     <w:lsdException w:name="Outline List 1" w:semiHidden="1" w:unhideWhenUsed="1"/>
@@ -10937,11 +10860,8 @@
     <w:lsdException w:name="Table Contemporary" w:semiHidden="1" w:unhideWhenUsed="1"/>
     <w:lsdException w:name="Table Elegant" w:semiHidden="1" w:unhideWhenUsed="1"/>
     <w:lsdException w:name="Table Professional" w:semiHidden="1" w:unhideWhenUsed="1"/>
-    <w:lsdException w:name="Table Subtle 1" w:semiHidden="1" w:unhideWhenUsed="1"/>
     <w:lsdException w:name="Table Subtle 2" w:semiHidden="1" w:unhideWhenUsed="1"/>
     <w:lsdException w:name="Table Web 1" w:semiHidden="1" w:unhideWhenUsed="1"/>
-    <w:lsdException w:name="Table Web 2" w:semiHidden="1" w:unhideWhenUsed="1"/>
-    <w:lsdException w:name="Table Web 3" w:semiHidden="1" w:unhideWhenUsed="1"/>
     <w:lsdException w:name="Balloon Text" w:semiHidden="1" w:unhideWhenUsed="1"/>
     <w:lsdException w:name="Table Grid" w:uiPriority="39"/>
     <w:lsdException w:name="Table Theme" w:semiHidden="1" w:unhideWhenUsed="1"/>
@@ -11160,6 +11080,11 @@
     <w:lsdException w:name="List Table 5 Dark Accent 6" w:uiPriority="50"/>
     <w:lsdException w:name="List Table 6 Colorful Accent 6" w:uiPriority="51"/>
     <w:lsdException w:name="List Table 7 Colorful Accent 6" w:uiPriority="52"/>
+    <w:lsdException w:name="Mention" w:semiHidden="1" w:unhideWhenUsed="1"/>
+    <w:lsdException w:name="Smart Hyperlink" w:semiHidden="1" w:unhideWhenUsed="1"/>
+    <w:lsdException w:name="Hashtag" w:semiHidden="1" w:unhideWhenUsed="1"/>
+    <w:lsdException w:name="Unresolved Mention" w:semiHidden="1" w:unhideWhenUsed="1"/>
+    <w:lsdException w:name="Smart Link" w:semiHidden="1" w:unhideWhenUsed="1"/>
   </w:latentStyles>
   <w:style w:type="paragraph" w:default="1" w:styleId="a">
     <w:name w:val="Normal"/>

</xml_diff>

<commit_message>
Update: app logic, database schema, docs and styles
</commit_message>
<xml_diff>
--- a/docs/Техническое задание.docx
+++ b/docs/Техническое задание.docx
@@ -1,6 +1,6 @@
 
 <file path=word/document.xml><?xml version="1.0" encoding="utf-8"?>
-<w:document xmlns:wpc="http://schemas.microsoft.com/office/word/2010/wordprocessingCanvas" xmlns:cx="http://schemas.microsoft.com/office/drawing/2014/chartex" xmlns:cx1="http://schemas.microsoft.com/office/drawing/2015/9/8/chartex" xmlns:cx2="http://schemas.microsoft.com/office/drawing/2015/10/21/chartex" xmlns:cx3="http://schemas.microsoft.com/office/drawing/2016/5/9/chartex" xmlns:cx4="http://schemas.microsoft.com/office/drawing/2016/5/10/chartex" xmlns:cx5="http://schemas.microsoft.com/office/drawing/2016/5/11/chartex" xmlns:cx6="http://schemas.microsoft.com/office/drawing/2016/5/12/chartex" xmlns:cx7="http://schemas.microsoft.com/office/drawing/2016/5/13/chartex" xmlns:cx8="http://schemas.microsoft.com/office/drawing/2016/5/14/chartex" xmlns:mc="http://schemas.openxmlformats.org/markup-compatibility/2006" xmlns:aink="http://schemas.microsoft.com/office/drawing/2016/ink" xmlns:am3d="http://schemas.microsoft.com/office/drawing/2017/model3d" xmlns:o="urn:schemas-microsoft-com:office:office" xmlns:r="http://schemas.openxmlformats.org/officeDocument/2006/relationships" xmlns:m="http://schemas.openxmlformats.org/officeDocument/2006/math" xmlns:v="urn:schemas-microsoft-com:vml" xmlns:wp14="http://schemas.microsoft.com/office/word/2010/wordprocessingDrawing" xmlns:wp="http://schemas.openxmlformats.org/drawingml/2006/wordprocessingDrawing" xmlns:w10="urn:schemas-microsoft-com:office:word" xmlns:w="http://schemas.openxmlformats.org/wordprocessingml/2006/main" xmlns:w14="http://schemas.microsoft.com/office/word/2010/wordml" xmlns:w15="http://schemas.microsoft.com/office/word/2012/wordml" xmlns:w16cex="http://schemas.microsoft.com/office/word/2018/wordml/cex" xmlns:w16cid="http://schemas.microsoft.com/office/word/2016/wordml/cid" xmlns:w16="http://schemas.microsoft.com/office/word/2018/wordml" xmlns:w16sdtdh="http://schemas.microsoft.com/office/word/2020/wordml/sdtdatahash" xmlns:w16se="http://schemas.microsoft.com/office/word/2015/wordml/symex" xmlns:wpg="http://schemas.microsoft.com/office/word/2010/wordprocessingGroup" xmlns:wpi="http://schemas.microsoft.com/office/word/2010/wordprocessingInk" xmlns:wne="http://schemas.microsoft.com/office/word/2006/wordml" xmlns:wps="http://schemas.microsoft.com/office/word/2010/wordprocessingShape" mc:Ignorable="w14 w15 w16se w16cid w16 w16cex w16sdtdh wp14">
+<w:document xmlns:wpc="http://schemas.microsoft.com/office/word/2010/wordprocessingCanvas" xmlns:cx="http://schemas.microsoft.com/office/drawing/2014/chartex" xmlns:mc="http://schemas.openxmlformats.org/markup-compatibility/2006" xmlns:o="urn:schemas-microsoft-com:office:office" xmlns:r="http://schemas.openxmlformats.org/officeDocument/2006/relationships" xmlns:m="http://schemas.openxmlformats.org/officeDocument/2006/math" xmlns:v="urn:schemas-microsoft-com:vml" xmlns:wp14="http://schemas.microsoft.com/office/word/2010/wordprocessingDrawing" xmlns:wp="http://schemas.openxmlformats.org/drawingml/2006/wordprocessingDrawing" xmlns:w10="urn:schemas-microsoft-com:office:word" xmlns:w="http://schemas.openxmlformats.org/wordprocessingml/2006/main" xmlns:w14="http://schemas.microsoft.com/office/word/2010/wordml" xmlns:w15="http://schemas.microsoft.com/office/word/2012/wordml" xmlns:w16se="http://schemas.microsoft.com/office/word/2015/wordml/symex" xmlns:wpg="http://schemas.microsoft.com/office/word/2010/wordprocessingGroup" xmlns:wpi="http://schemas.microsoft.com/office/word/2010/wordprocessingInk" xmlns:wne="http://schemas.microsoft.com/office/word/2006/wordml" xmlns:wps="http://schemas.microsoft.com/office/word/2010/wordprocessingShape" mc:Ignorable="w14 w15 w16se wp14">
   <w:body>
     <w:p>
       <w:pPr>
@@ -4194,6 +4194,192 @@
     </w:p>
     <w:p>
       <w:pPr>
+        <w:pStyle w:val="a3"/>
+        <w:numPr>
+          <w:ilvl w:val="1"/>
+          <w:numId w:val="18"/>
+        </w:numPr>
+        <w:spacing w:line="256" w:lineRule="auto"/>
+        <w:rPr>
+          <w:rFonts w:ascii="Times New Roman" w:hAnsi="Times New Roman" w:cs="Times New Roman"/>
+          <w:sz w:val="24"/>
+        </w:rPr>
+      </w:pPr>
+      <w:r>
+        <w:rPr>
+          <w:rFonts w:ascii="Times New Roman" w:hAnsi="Times New Roman" w:cs="Times New Roman"/>
+          <w:sz w:val="24"/>
+        </w:rPr>
+        <w:t>Разработка программного модуля</w:t>
+      </w:r>
+    </w:p>
+    <w:p>
+      <w:pPr>
+        <w:pStyle w:val="a3"/>
+        <w:spacing w:line="256" w:lineRule="auto"/>
+        <w:ind w:left="927"/>
+        <w:rPr>
+          <w:rFonts w:ascii="Times New Roman" w:hAnsi="Times New Roman" w:cs="Times New Roman"/>
+          <w:sz w:val="24"/>
+        </w:rPr>
+      </w:pPr>
+      <w:bookmarkStart w:id="0" w:name="_GoBack"/>
+      <w:bookmarkEnd w:id="0"/>
+    </w:p>
+    <w:p>
+      <w:pPr>
+        <w:pStyle w:val="a3"/>
+        <w:numPr>
+          <w:ilvl w:val="1"/>
+          <w:numId w:val="18"/>
+        </w:numPr>
+        <w:spacing w:line="256" w:lineRule="auto"/>
+        <w:rPr>
+          <w:rFonts w:ascii="Times New Roman" w:hAnsi="Times New Roman" w:cs="Times New Roman"/>
+          <w:sz w:val="24"/>
+        </w:rPr>
+      </w:pPr>
+      <w:r>
+        <w:rPr>
+          <w:rFonts w:ascii="Times New Roman" w:hAnsi="Times New Roman" w:cs="Times New Roman"/>
+          <w:sz w:val="24"/>
+        </w:rPr>
+        <w:t>Текст программы</w:t>
+      </w:r>
+    </w:p>
+    <w:p>
+      <w:pPr>
+        <w:ind w:left="426"/>
+        <w:rPr>
+          <w:rFonts w:ascii="Times New Roman" w:hAnsi="Times New Roman" w:cs="Times New Roman"/>
+          <w:sz w:val="24"/>
+        </w:rPr>
+      </w:pPr>
+      <w:r>
+        <w:rPr>
+          <w:rFonts w:ascii="Times New Roman" w:hAnsi="Times New Roman" w:cs="Times New Roman"/>
+          <w:sz w:val="24"/>
+        </w:rPr>
+        <w:t xml:space="preserve"> 4.  Руководство пользователя</w:t>
+      </w:r>
+    </w:p>
+    <w:p>
+      <w:pPr>
+        <w:ind w:left="426"/>
+        <w:rPr>
+          <w:rFonts w:ascii="Times New Roman" w:hAnsi="Times New Roman" w:cs="Times New Roman"/>
+          <w:sz w:val="24"/>
+        </w:rPr>
+      </w:pPr>
+      <w:r>
+        <w:rPr>
+          <w:rFonts w:ascii="Times New Roman" w:hAnsi="Times New Roman" w:cs="Times New Roman"/>
+          <w:sz w:val="24"/>
+        </w:rPr>
+        <w:tab/>
+        <w:t>4.1 Выполнение программного модуля</w:t>
+      </w:r>
+    </w:p>
+    <w:p>
+      <w:pPr>
+        <w:ind w:left="1134"/>
+        <w:rPr>
+          <w:rFonts w:ascii="Times New Roman" w:hAnsi="Times New Roman" w:cs="Times New Roman"/>
+          <w:sz w:val="24"/>
+        </w:rPr>
+      </w:pPr>
+      <w:r>
+        <w:rPr>
+          <w:rFonts w:ascii="Times New Roman" w:hAnsi="Times New Roman" w:cs="Times New Roman"/>
+          <w:sz w:val="24"/>
+        </w:rPr>
+        <w:t>Должна быть указана последовательность действий пользователя, обеспечивающих загрузку, запуск, выполнение и завершение программного модуля.</w:t>
+      </w:r>
+    </w:p>
+    <w:p>
+      <w:pPr>
+        <w:ind w:left="709"/>
+        <w:rPr>
+          <w:rFonts w:ascii="Times New Roman" w:hAnsi="Times New Roman" w:cs="Times New Roman"/>
+          <w:sz w:val="24"/>
+        </w:rPr>
+      </w:pPr>
+      <w:r>
+        <w:rPr>
+          <w:rFonts w:ascii="Times New Roman" w:hAnsi="Times New Roman" w:cs="Times New Roman"/>
+          <w:sz w:val="24"/>
+        </w:rPr>
+        <w:t>4.2 Сообщения пользователю</w:t>
+      </w:r>
+    </w:p>
+    <w:p>
+      <w:pPr>
+        <w:ind w:left="1134"/>
+        <w:rPr>
+          <w:rFonts w:ascii="Times New Roman" w:hAnsi="Times New Roman" w:cs="Times New Roman"/>
+          <w:sz w:val="24"/>
+        </w:rPr>
+      </w:pPr>
+      <w:r>
+        <w:rPr>
+          <w:rFonts w:ascii="Times New Roman" w:hAnsi="Times New Roman" w:cs="Times New Roman"/>
+          <w:sz w:val="24"/>
+        </w:rPr>
+        <w:t>Приведено описание сообщений пользователю и возможные действия пользователя в ответ на эти сообщения.</w:t>
+      </w:r>
+    </w:p>
+    <w:p>
+      <w:pPr>
+        <w:rPr>
+          <w:rFonts w:ascii="Times New Roman" w:hAnsi="Times New Roman" w:cs="Times New Roman"/>
+          <w:sz w:val="24"/>
+        </w:rPr>
+      </w:pPr>
+      <w:r>
+        <w:rPr>
+          <w:rFonts w:ascii="Times New Roman" w:hAnsi="Times New Roman" w:cs="Times New Roman"/>
+          <w:sz w:val="24"/>
+        </w:rPr>
+        <w:t>5. Тестирование и отладка программного модуля</w:t>
+      </w:r>
+    </w:p>
+    <w:p>
+      <w:pPr>
+        <w:rPr>
+          <w:rFonts w:ascii="Times New Roman" w:hAnsi="Times New Roman" w:cs="Times New Roman"/>
+          <w:sz w:val="24"/>
+        </w:rPr>
+      </w:pPr>
+      <w:r>
+        <w:rPr>
+          <w:rFonts w:ascii="Times New Roman" w:hAnsi="Times New Roman" w:cs="Times New Roman"/>
+          <w:sz w:val="24"/>
+        </w:rPr>
+        <w:t>Заключение</w:t>
+      </w:r>
+    </w:p>
+    <w:p>
+      <w:pPr>
+        <w:tabs>
+          <w:tab w:val="left" w:pos="1134"/>
+        </w:tabs>
+        <w:ind w:right="-43"/>
+        <w:rPr>
+          <w:rFonts w:ascii="Times New Roman" w:hAnsi="Times New Roman" w:cs="Times New Roman"/>
+          <w:sz w:val="24"/>
+        </w:rPr>
+      </w:pPr>
+      <w:r>
+        <w:rPr>
+          <w:rFonts w:ascii="Times New Roman" w:hAnsi="Times New Roman" w:cs="Times New Roman"/>
+          <w:sz w:val="24"/>
+        </w:rPr>
+        <w:t>Список литературы</w:t>
+      </w:r>
+    </w:p>
+    <w:p>
+      <w:pPr>
+        <w:ind w:left="708"/>
         <w:rPr>
           <w:rFonts w:ascii="Times New Roman" w:hAnsi="Times New Roman" w:cs="Times New Roman"/>
           <w:sz w:val="24"/>
@@ -4245,6 +4431,7 @@
           <w:sz w:val="24"/>
           <w:lang w:eastAsia="ru-RU"/>
         </w:rPr>
+        <w:lastRenderedPageBreak/>
         <w:drawing>
           <wp:inline distT="0" distB="0" distL="0" distR="0" wp14:anchorId="061DE546" wp14:editId="750C1006">
             <wp:extent cx="5940425" cy="5610225"/>
@@ -4430,6 +4617,7 @@
           <w:rFonts w:ascii="Times New Roman" w:hAnsi="Times New Roman" w:cs="Times New Roman"/>
           <w:noProof/>
           <w:sz w:val="24"/>
+          <w:lang w:eastAsia="ru-RU"/>
         </w:rPr>
         <w:drawing>
           <wp:inline distT="0" distB="0" distL="0" distR="0" wp14:anchorId="708E7D78" wp14:editId="696F7D70">
@@ -4532,7 +4720,7 @@
 </file>
 
 <file path=word/endnotes.xml><?xml version="1.0" encoding="utf-8"?>
-<w:endnotes xmlns:wpc="http://schemas.microsoft.com/office/word/2010/wordprocessingCanvas" xmlns:cx="http://schemas.microsoft.com/office/drawing/2014/chartex" xmlns:cx1="http://schemas.microsoft.com/office/drawing/2015/9/8/chartex" xmlns:cx2="http://schemas.microsoft.com/office/drawing/2015/10/21/chartex" xmlns:cx3="http://schemas.microsoft.com/office/drawing/2016/5/9/chartex" xmlns:cx4="http://schemas.microsoft.com/office/drawing/2016/5/10/chartex" xmlns:cx5="http://schemas.microsoft.com/office/drawing/2016/5/11/chartex" xmlns:cx6="http://schemas.microsoft.com/office/drawing/2016/5/12/chartex" xmlns:cx7="http://schemas.microsoft.com/office/drawing/2016/5/13/chartex" xmlns:cx8="http://schemas.microsoft.com/office/drawing/2016/5/14/chartex" xmlns:mc="http://schemas.openxmlformats.org/markup-compatibility/2006" xmlns:aink="http://schemas.microsoft.com/office/drawing/2016/ink" xmlns:am3d="http://schemas.microsoft.com/office/drawing/2017/model3d" xmlns:o="urn:schemas-microsoft-com:office:office" xmlns:r="http://schemas.openxmlformats.org/officeDocument/2006/relationships" xmlns:m="http://schemas.openxmlformats.org/officeDocument/2006/math" xmlns:v="urn:schemas-microsoft-com:vml" xmlns:wp14="http://schemas.microsoft.com/office/word/2010/wordprocessingDrawing" xmlns:wp="http://schemas.openxmlformats.org/drawingml/2006/wordprocessingDrawing" xmlns:w10="urn:schemas-microsoft-com:office:word" xmlns:w="http://schemas.openxmlformats.org/wordprocessingml/2006/main" xmlns:w14="http://schemas.microsoft.com/office/word/2010/wordml" xmlns:w15="http://schemas.microsoft.com/office/word/2012/wordml" xmlns:w16cex="http://schemas.microsoft.com/office/word/2018/wordml/cex" xmlns:w16cid="http://schemas.microsoft.com/office/word/2016/wordml/cid" xmlns:w16="http://schemas.microsoft.com/office/word/2018/wordml" xmlns:w16sdtdh="http://schemas.microsoft.com/office/word/2020/wordml/sdtdatahash" xmlns:w16se="http://schemas.microsoft.com/office/word/2015/wordml/symex" xmlns:wpg="http://schemas.microsoft.com/office/word/2010/wordprocessingGroup" xmlns:wpi="http://schemas.microsoft.com/office/word/2010/wordprocessingInk" xmlns:wne="http://schemas.microsoft.com/office/word/2006/wordml" xmlns:wps="http://schemas.microsoft.com/office/word/2010/wordprocessingShape" mc:Ignorable="w14 w15 w16se w16cid w16 w16cex w16sdtdh wp14">
+<w:endnotes xmlns:wpc="http://schemas.microsoft.com/office/word/2010/wordprocessingCanvas" xmlns:cx="http://schemas.microsoft.com/office/drawing/2014/chartex" xmlns:mc="http://schemas.openxmlformats.org/markup-compatibility/2006" xmlns:o="urn:schemas-microsoft-com:office:office" xmlns:r="http://schemas.openxmlformats.org/officeDocument/2006/relationships" xmlns:m="http://schemas.openxmlformats.org/officeDocument/2006/math" xmlns:v="urn:schemas-microsoft-com:vml" xmlns:wp14="http://schemas.microsoft.com/office/word/2010/wordprocessingDrawing" xmlns:wp="http://schemas.openxmlformats.org/drawingml/2006/wordprocessingDrawing" xmlns:w10="urn:schemas-microsoft-com:office:word" xmlns:w="http://schemas.openxmlformats.org/wordprocessingml/2006/main" xmlns:w14="http://schemas.microsoft.com/office/word/2010/wordml" xmlns:w15="http://schemas.microsoft.com/office/word/2012/wordml" xmlns:w16se="http://schemas.microsoft.com/office/word/2015/wordml/symex" xmlns:wpg="http://schemas.microsoft.com/office/word/2010/wordprocessingGroup" xmlns:wpi="http://schemas.microsoft.com/office/word/2010/wordprocessingInk" xmlns:wne="http://schemas.microsoft.com/office/word/2006/wordml" xmlns:wps="http://schemas.microsoft.com/office/word/2010/wordprocessingShape" mc:Ignorable="w14 w15 w16se wp14">
   <w:endnote w:type="separator" w:id="-1">
     <w:p>
       <w:pPr>
@@ -4557,7 +4745,7 @@
 </file>
 
 <file path=word/footnotes.xml><?xml version="1.0" encoding="utf-8"?>
-<w:footnotes xmlns:wpc="http://schemas.microsoft.com/office/word/2010/wordprocessingCanvas" xmlns:cx="http://schemas.microsoft.com/office/drawing/2014/chartex" xmlns:cx1="http://schemas.microsoft.com/office/drawing/2015/9/8/chartex" xmlns:cx2="http://schemas.microsoft.com/office/drawing/2015/10/21/chartex" xmlns:cx3="http://schemas.microsoft.com/office/drawing/2016/5/9/chartex" xmlns:cx4="http://schemas.microsoft.com/office/drawing/2016/5/10/chartex" xmlns:cx5="http://schemas.microsoft.com/office/drawing/2016/5/11/chartex" xmlns:cx6="http://schemas.microsoft.com/office/drawing/2016/5/12/chartex" xmlns:cx7="http://schemas.microsoft.com/office/drawing/2016/5/13/chartex" xmlns:cx8="http://schemas.microsoft.com/office/drawing/2016/5/14/chartex" xmlns:mc="http://schemas.openxmlformats.org/markup-compatibility/2006" xmlns:aink="http://schemas.microsoft.com/office/drawing/2016/ink" xmlns:am3d="http://schemas.microsoft.com/office/drawing/2017/model3d" xmlns:o="urn:schemas-microsoft-com:office:office" xmlns:r="http://schemas.openxmlformats.org/officeDocument/2006/relationships" xmlns:m="http://schemas.openxmlformats.org/officeDocument/2006/math" xmlns:v="urn:schemas-microsoft-com:vml" xmlns:wp14="http://schemas.microsoft.com/office/word/2010/wordprocessingDrawing" xmlns:wp="http://schemas.openxmlformats.org/drawingml/2006/wordprocessingDrawing" xmlns:w10="urn:schemas-microsoft-com:office:word" xmlns:w="http://schemas.openxmlformats.org/wordprocessingml/2006/main" xmlns:w14="http://schemas.microsoft.com/office/word/2010/wordml" xmlns:w15="http://schemas.microsoft.com/office/word/2012/wordml" xmlns:w16cex="http://schemas.microsoft.com/office/word/2018/wordml/cex" xmlns:w16cid="http://schemas.microsoft.com/office/word/2016/wordml/cid" xmlns:w16="http://schemas.microsoft.com/office/word/2018/wordml" xmlns:w16sdtdh="http://schemas.microsoft.com/office/word/2020/wordml/sdtdatahash" xmlns:w16se="http://schemas.microsoft.com/office/word/2015/wordml/symex" xmlns:wpg="http://schemas.microsoft.com/office/word/2010/wordprocessingGroup" xmlns:wpi="http://schemas.microsoft.com/office/word/2010/wordprocessingInk" xmlns:wne="http://schemas.microsoft.com/office/word/2006/wordml" xmlns:wps="http://schemas.microsoft.com/office/word/2010/wordprocessingShape" mc:Ignorable="w14 w15 w16se w16cid w16 w16cex w16sdtdh wp14">
+<w:footnotes xmlns:wpc="http://schemas.microsoft.com/office/word/2010/wordprocessingCanvas" xmlns:cx="http://schemas.microsoft.com/office/drawing/2014/chartex" xmlns:mc="http://schemas.openxmlformats.org/markup-compatibility/2006" xmlns:o="urn:schemas-microsoft-com:office:office" xmlns:r="http://schemas.openxmlformats.org/officeDocument/2006/relationships" xmlns:m="http://schemas.openxmlformats.org/officeDocument/2006/math" xmlns:v="urn:schemas-microsoft-com:vml" xmlns:wp14="http://schemas.microsoft.com/office/word/2010/wordprocessingDrawing" xmlns:wp="http://schemas.openxmlformats.org/drawingml/2006/wordprocessingDrawing" xmlns:w10="urn:schemas-microsoft-com:office:word" xmlns:w="http://schemas.openxmlformats.org/wordprocessingml/2006/main" xmlns:w14="http://schemas.microsoft.com/office/word/2010/wordml" xmlns:w15="http://schemas.microsoft.com/office/word/2012/wordml" xmlns:w16se="http://schemas.microsoft.com/office/word/2015/wordml/symex" xmlns:wpg="http://schemas.microsoft.com/office/word/2010/wordprocessingGroup" xmlns:wpi="http://schemas.microsoft.com/office/word/2010/wordprocessingInk" xmlns:wne="http://schemas.microsoft.com/office/word/2006/wordml" xmlns:wps="http://schemas.microsoft.com/office/word/2010/wordprocessingShape" mc:Ignorable="w14 w15 w16se wp14">
   <w:footnote w:type="separator" w:id="-1">
     <w:p>
       <w:pPr>
@@ -4582,7 +4770,7 @@
 </file>
 
 <file path=word/numbering.xml><?xml version="1.0" encoding="utf-8"?>
-<w:numbering xmlns:wpc="http://schemas.microsoft.com/office/word/2010/wordprocessingCanvas" xmlns:cx="http://schemas.microsoft.com/office/drawing/2014/chartex" xmlns:cx1="http://schemas.microsoft.com/office/drawing/2015/9/8/chartex" xmlns:cx2="http://schemas.microsoft.com/office/drawing/2015/10/21/chartex" xmlns:cx3="http://schemas.microsoft.com/office/drawing/2016/5/9/chartex" xmlns:cx4="http://schemas.microsoft.com/office/drawing/2016/5/10/chartex" xmlns:cx5="http://schemas.microsoft.com/office/drawing/2016/5/11/chartex" xmlns:cx6="http://schemas.microsoft.com/office/drawing/2016/5/12/chartex" xmlns:cx7="http://schemas.microsoft.com/office/drawing/2016/5/13/chartex" xmlns:cx8="http://schemas.microsoft.com/office/drawing/2016/5/14/chartex" xmlns:mc="http://schemas.openxmlformats.org/markup-compatibility/2006" xmlns:aink="http://schemas.microsoft.com/office/drawing/2016/ink" xmlns:am3d="http://schemas.microsoft.com/office/drawing/2017/model3d" xmlns:o="urn:schemas-microsoft-com:office:office" xmlns:r="http://schemas.openxmlformats.org/officeDocument/2006/relationships" xmlns:m="http://schemas.openxmlformats.org/officeDocument/2006/math" xmlns:v="urn:schemas-microsoft-com:vml" xmlns:wp14="http://schemas.microsoft.com/office/word/2010/wordprocessingDrawing" xmlns:wp="http://schemas.openxmlformats.org/drawingml/2006/wordprocessingDrawing" xmlns:w10="urn:schemas-microsoft-com:office:word" xmlns:w="http://schemas.openxmlformats.org/wordprocessingml/2006/main" xmlns:w14="http://schemas.microsoft.com/office/word/2010/wordml" xmlns:w15="http://schemas.microsoft.com/office/word/2012/wordml" xmlns:w16cex="http://schemas.microsoft.com/office/word/2018/wordml/cex" xmlns:w16cid="http://schemas.microsoft.com/office/word/2016/wordml/cid" xmlns:w16="http://schemas.microsoft.com/office/word/2018/wordml" xmlns:w16sdtdh="http://schemas.microsoft.com/office/word/2020/wordml/sdtdatahash" xmlns:w16se="http://schemas.microsoft.com/office/word/2015/wordml/symex" xmlns:wpg="http://schemas.microsoft.com/office/word/2010/wordprocessingGroup" xmlns:wpi="http://schemas.microsoft.com/office/word/2010/wordprocessingInk" xmlns:wne="http://schemas.microsoft.com/office/word/2006/wordml" xmlns:wps="http://schemas.microsoft.com/office/word/2010/wordprocessingShape" mc:Ignorable="w14 w15 w16se w16cid w16 w16cex w16sdtdh wp14">
+<w:numbering xmlns:wpc="http://schemas.microsoft.com/office/word/2010/wordprocessingCanvas" xmlns:cx="http://schemas.microsoft.com/office/drawing/2014/chartex" xmlns:mc="http://schemas.openxmlformats.org/markup-compatibility/2006" xmlns:o="urn:schemas-microsoft-com:office:office" xmlns:r="http://schemas.openxmlformats.org/officeDocument/2006/relationships" xmlns:m="http://schemas.openxmlformats.org/officeDocument/2006/math" xmlns:v="urn:schemas-microsoft-com:vml" xmlns:wp14="http://schemas.microsoft.com/office/word/2010/wordprocessingDrawing" xmlns:wp="http://schemas.openxmlformats.org/drawingml/2006/wordprocessingDrawing" xmlns:w10="urn:schemas-microsoft-com:office:word" xmlns:w="http://schemas.openxmlformats.org/wordprocessingml/2006/main" xmlns:w14="http://schemas.microsoft.com/office/word/2010/wordml" xmlns:w15="http://schemas.microsoft.com/office/word/2012/wordml" xmlns:w16se="http://schemas.microsoft.com/office/word/2015/wordml/symex" xmlns:wpg="http://schemas.microsoft.com/office/word/2010/wordprocessingGroup" xmlns:wpi="http://schemas.microsoft.com/office/word/2010/wordprocessingInk" xmlns:wne="http://schemas.microsoft.com/office/word/2006/wordml" xmlns:wps="http://schemas.microsoft.com/office/word/2010/wordprocessingShape" mc:Ignorable="w14 w15 w16se wp14">
   <w:abstractNum w:abstractNumId="0" w15:restartNumberingAfterBreak="0">
     <w:nsid w:val="01E5558F"/>
     <w:multiLevelType w:val="multilevel"/>
@@ -6629,6 +6817,92 @@
     </w:lvl>
   </w:abstractNum>
   <w:abstractNum w:abstractNumId="16" w15:restartNumberingAfterBreak="0">
+    <w:nsid w:val="34C514EF"/>
+    <w:multiLevelType w:val="hybridMultilevel"/>
+    <w:tmpl w:val="8048D85E"/>
+    <w:lvl w:ilvl="0" w:tplc="0419000F">
+      <w:start w:val="1"/>
+      <w:numFmt w:val="decimal"/>
+      <w:lvlText w:val="%1."/>
+      <w:lvlJc w:val="left"/>
+      <w:pPr>
+        <w:ind w:left="720" w:hanging="360"/>
+      </w:pPr>
+    </w:lvl>
+    <w:lvl w:ilvl="1" w:tplc="04190019" w:tentative="1">
+      <w:start w:val="1"/>
+      <w:numFmt w:val="lowerLetter"/>
+      <w:lvlText w:val="%2."/>
+      <w:lvlJc w:val="left"/>
+      <w:pPr>
+        <w:ind w:left="1440" w:hanging="360"/>
+      </w:pPr>
+    </w:lvl>
+    <w:lvl w:ilvl="2" w:tplc="0419001B" w:tentative="1">
+      <w:start w:val="1"/>
+      <w:numFmt w:val="lowerRoman"/>
+      <w:lvlText w:val="%3."/>
+      <w:lvlJc w:val="right"/>
+      <w:pPr>
+        <w:ind w:left="2160" w:hanging="180"/>
+      </w:pPr>
+    </w:lvl>
+    <w:lvl w:ilvl="3" w:tplc="0419000F" w:tentative="1">
+      <w:start w:val="1"/>
+      <w:numFmt w:val="decimal"/>
+      <w:lvlText w:val="%4."/>
+      <w:lvlJc w:val="left"/>
+      <w:pPr>
+        <w:ind w:left="2880" w:hanging="360"/>
+      </w:pPr>
+    </w:lvl>
+    <w:lvl w:ilvl="4" w:tplc="04190019" w:tentative="1">
+      <w:start w:val="1"/>
+      <w:numFmt w:val="lowerLetter"/>
+      <w:lvlText w:val="%5."/>
+      <w:lvlJc w:val="left"/>
+      <w:pPr>
+        <w:ind w:left="3600" w:hanging="360"/>
+      </w:pPr>
+    </w:lvl>
+    <w:lvl w:ilvl="5" w:tplc="0419001B" w:tentative="1">
+      <w:start w:val="1"/>
+      <w:numFmt w:val="lowerRoman"/>
+      <w:lvlText w:val="%6."/>
+      <w:lvlJc w:val="right"/>
+      <w:pPr>
+        <w:ind w:left="4320" w:hanging="180"/>
+      </w:pPr>
+    </w:lvl>
+    <w:lvl w:ilvl="6" w:tplc="0419000F" w:tentative="1">
+      <w:start w:val="1"/>
+      <w:numFmt w:val="decimal"/>
+      <w:lvlText w:val="%7."/>
+      <w:lvlJc w:val="left"/>
+      <w:pPr>
+        <w:ind w:left="5040" w:hanging="360"/>
+      </w:pPr>
+    </w:lvl>
+    <w:lvl w:ilvl="7" w:tplc="04190019" w:tentative="1">
+      <w:start w:val="1"/>
+      <w:numFmt w:val="lowerLetter"/>
+      <w:lvlText w:val="%8."/>
+      <w:lvlJc w:val="left"/>
+      <w:pPr>
+        <w:ind w:left="5760" w:hanging="360"/>
+      </w:pPr>
+    </w:lvl>
+    <w:lvl w:ilvl="8" w:tplc="0419001B" w:tentative="1">
+      <w:start w:val="1"/>
+      <w:numFmt w:val="lowerRoman"/>
+      <w:lvlText w:val="%9."/>
+      <w:lvlJc w:val="right"/>
+      <w:pPr>
+        <w:ind w:left="6480" w:hanging="180"/>
+      </w:pPr>
+    </w:lvl>
+  </w:abstractNum>
+  <w:abstractNum w:abstractNumId="17" w15:restartNumberingAfterBreak="0">
     <w:nsid w:val="34DE6975"/>
     <w:multiLevelType w:val="hybridMultilevel"/>
     <w:tmpl w:val="D63898B0"/>
@@ -6741,7 +7015,7 @@
       </w:rPr>
     </w:lvl>
   </w:abstractNum>
-  <w:abstractNum w:abstractNumId="17" w15:restartNumberingAfterBreak="0">
+  <w:abstractNum w:abstractNumId="18" w15:restartNumberingAfterBreak="0">
     <w:nsid w:val="36954156"/>
     <w:multiLevelType w:val="hybridMultilevel"/>
     <w:tmpl w:val="6A0CC4F4"/>
@@ -6854,7 +7128,7 @@
       </w:rPr>
     </w:lvl>
   </w:abstractNum>
-  <w:abstractNum w:abstractNumId="18" w15:restartNumberingAfterBreak="0">
+  <w:abstractNum w:abstractNumId="19" w15:restartNumberingAfterBreak="0">
     <w:nsid w:val="3A0E5C83"/>
     <w:multiLevelType w:val="hybridMultilevel"/>
     <w:tmpl w:val="B470CCBC"/>
@@ -6967,7 +7241,7 @@
       </w:rPr>
     </w:lvl>
   </w:abstractNum>
-  <w:abstractNum w:abstractNumId="19" w15:restartNumberingAfterBreak="0">
+  <w:abstractNum w:abstractNumId="20" w15:restartNumberingAfterBreak="0">
     <w:nsid w:val="3B8F2556"/>
     <w:multiLevelType w:val="multilevel"/>
     <w:tmpl w:val="027237BA"/>
@@ -7116,7 +7390,7 @@
       </w:rPr>
     </w:lvl>
   </w:abstractNum>
-  <w:abstractNum w:abstractNumId="20" w15:restartNumberingAfterBreak="0">
+  <w:abstractNum w:abstractNumId="21" w15:restartNumberingAfterBreak="0">
     <w:nsid w:val="3D38544A"/>
     <w:multiLevelType w:val="hybridMultilevel"/>
     <w:tmpl w:val="DE84E90C"/>
@@ -7229,7 +7503,7 @@
       </w:rPr>
     </w:lvl>
   </w:abstractNum>
-  <w:abstractNum w:abstractNumId="21" w15:restartNumberingAfterBreak="0">
+  <w:abstractNum w:abstractNumId="22" w15:restartNumberingAfterBreak="0">
     <w:nsid w:val="3D4715E9"/>
     <w:multiLevelType w:val="multilevel"/>
     <w:tmpl w:val="5E6CDD2E"/>
@@ -7378,7 +7652,7 @@
       </w:rPr>
     </w:lvl>
   </w:abstractNum>
-  <w:abstractNum w:abstractNumId="22" w15:restartNumberingAfterBreak="0">
+  <w:abstractNum w:abstractNumId="23" w15:restartNumberingAfterBreak="0">
     <w:nsid w:val="3F6C5672"/>
     <w:multiLevelType w:val="hybridMultilevel"/>
     <w:tmpl w:val="36861B64"/>
@@ -7491,7 +7765,7 @@
       </w:rPr>
     </w:lvl>
   </w:abstractNum>
-  <w:abstractNum w:abstractNumId="23" w15:restartNumberingAfterBreak="0">
+  <w:abstractNum w:abstractNumId="24" w15:restartNumberingAfterBreak="0">
     <w:nsid w:val="403153BC"/>
     <w:multiLevelType w:val="hybridMultilevel"/>
     <w:tmpl w:val="23C47938"/>
@@ -7507,7 +7781,7 @@
         <w:rFonts w:ascii="Symbol" w:hAnsi="Symbol" w:hint="default"/>
       </w:rPr>
     </w:lvl>
-    <w:lvl w:ilvl="1" w:tplc="04190003" w:tentative="1">
+    <w:lvl w:ilvl="1" w:tplc="04190003">
       <w:start w:val="1"/>
       <w:numFmt w:val="bullet"/>
       <w:lvlText w:val="o"/>
@@ -7604,7 +7878,7 @@
       </w:rPr>
     </w:lvl>
   </w:abstractNum>
-  <w:abstractNum w:abstractNumId="24" w15:restartNumberingAfterBreak="0">
+  <w:abstractNum w:abstractNumId="25" w15:restartNumberingAfterBreak="0">
     <w:nsid w:val="42447631"/>
     <w:multiLevelType w:val="multilevel"/>
     <w:tmpl w:val="34C61976"/>
@@ -7753,7 +8027,7 @@
       </w:rPr>
     </w:lvl>
   </w:abstractNum>
-  <w:abstractNum w:abstractNumId="25" w15:restartNumberingAfterBreak="0">
+  <w:abstractNum w:abstractNumId="26" w15:restartNumberingAfterBreak="0">
     <w:nsid w:val="44A249D8"/>
     <w:multiLevelType w:val="multilevel"/>
     <w:tmpl w:val="6ED8B064"/>
@@ -7902,7 +8176,7 @@
       </w:rPr>
     </w:lvl>
   </w:abstractNum>
-  <w:abstractNum w:abstractNumId="26" w15:restartNumberingAfterBreak="0">
+  <w:abstractNum w:abstractNumId="27" w15:restartNumberingAfterBreak="0">
     <w:nsid w:val="4619666D"/>
     <w:multiLevelType w:val="hybridMultilevel"/>
     <w:tmpl w:val="778C9D5E"/>
@@ -8015,7 +8289,7 @@
       </w:rPr>
     </w:lvl>
   </w:abstractNum>
-  <w:abstractNum w:abstractNumId="27" w15:restartNumberingAfterBreak="0">
+  <w:abstractNum w:abstractNumId="28" w15:restartNumberingAfterBreak="0">
     <w:nsid w:val="482C162B"/>
     <w:multiLevelType w:val="hybridMultilevel"/>
     <w:tmpl w:val="4BE054A6"/>
@@ -8128,7 +8402,7 @@
       </w:rPr>
     </w:lvl>
   </w:abstractNum>
-  <w:abstractNum w:abstractNumId="28" w15:restartNumberingAfterBreak="0">
+  <w:abstractNum w:abstractNumId="29" w15:restartNumberingAfterBreak="0">
     <w:nsid w:val="487E4C8B"/>
     <w:multiLevelType w:val="multilevel"/>
     <w:tmpl w:val="5D8052B4"/>
@@ -8241,7 +8515,7 @@
       </w:pPr>
     </w:lvl>
   </w:abstractNum>
-  <w:abstractNum w:abstractNumId="29" w15:restartNumberingAfterBreak="0">
+  <w:abstractNum w:abstractNumId="30" w15:restartNumberingAfterBreak="0">
     <w:nsid w:val="4AD055F8"/>
     <w:multiLevelType w:val="multilevel"/>
     <w:tmpl w:val="C9F2059C"/>
@@ -8390,7 +8664,7 @@
       </w:rPr>
     </w:lvl>
   </w:abstractNum>
-  <w:abstractNum w:abstractNumId="30" w15:restartNumberingAfterBreak="0">
+  <w:abstractNum w:abstractNumId="31" w15:restartNumberingAfterBreak="0">
     <w:nsid w:val="4B776AC6"/>
     <w:multiLevelType w:val="multilevel"/>
     <w:tmpl w:val="1A1AA200"/>
@@ -8539,7 +8813,7 @@
       </w:rPr>
     </w:lvl>
   </w:abstractNum>
-  <w:abstractNum w:abstractNumId="31" w15:restartNumberingAfterBreak="0">
+  <w:abstractNum w:abstractNumId="32" w15:restartNumberingAfterBreak="0">
     <w:nsid w:val="4C413129"/>
     <w:multiLevelType w:val="multilevel"/>
     <w:tmpl w:val="5FEEA0C2"/>
@@ -8656,7 +8930,101 @@
       </w:pPr>
     </w:lvl>
   </w:abstractNum>
-  <w:abstractNum w:abstractNumId="32" w15:restartNumberingAfterBreak="0">
+  <w:abstractNum w:abstractNumId="33" w15:restartNumberingAfterBreak="0">
+    <w:nsid w:val="4E654E3C"/>
+    <w:multiLevelType w:val="multilevel"/>
+    <w:tmpl w:val="36107BCA"/>
+    <w:lvl w:ilvl="0">
+      <w:start w:val="1"/>
+      <w:numFmt w:val="decimal"/>
+      <w:lvlText w:val="%1."/>
+      <w:lvlJc w:val="left"/>
+      <w:pPr>
+        <w:ind w:left="720" w:hanging="360"/>
+      </w:pPr>
+    </w:lvl>
+    <w:lvl w:ilvl="1">
+      <w:start w:val="1"/>
+      <w:numFmt w:val="decimal"/>
+      <w:isLgl/>
+      <w:lvlText w:val="%1.%2"/>
+      <w:lvlJc w:val="left"/>
+      <w:pPr>
+        <w:ind w:left="1080" w:hanging="360"/>
+      </w:pPr>
+    </w:lvl>
+    <w:lvl w:ilvl="2">
+      <w:start w:val="1"/>
+      <w:numFmt w:val="decimal"/>
+      <w:isLgl/>
+      <w:lvlText w:val="%1.%2.%3"/>
+      <w:lvlJc w:val="left"/>
+      <w:pPr>
+        <w:ind w:left="1800" w:hanging="720"/>
+      </w:pPr>
+    </w:lvl>
+    <w:lvl w:ilvl="3">
+      <w:start w:val="1"/>
+      <w:numFmt w:val="decimal"/>
+      <w:isLgl/>
+      <w:lvlText w:val="%1.%2.%3.%4"/>
+      <w:lvlJc w:val="left"/>
+      <w:pPr>
+        <w:ind w:left="2160" w:hanging="720"/>
+      </w:pPr>
+    </w:lvl>
+    <w:lvl w:ilvl="4">
+      <w:start w:val="1"/>
+      <w:numFmt w:val="decimal"/>
+      <w:isLgl/>
+      <w:lvlText w:val="%1.%2.%3.%4.%5"/>
+      <w:lvlJc w:val="left"/>
+      <w:pPr>
+        <w:ind w:left="2880" w:hanging="1080"/>
+      </w:pPr>
+    </w:lvl>
+    <w:lvl w:ilvl="5">
+      <w:start w:val="1"/>
+      <w:numFmt w:val="decimal"/>
+      <w:isLgl/>
+      <w:lvlText w:val="%1.%2.%3.%4.%5.%6"/>
+      <w:lvlJc w:val="left"/>
+      <w:pPr>
+        <w:ind w:left="3240" w:hanging="1080"/>
+      </w:pPr>
+    </w:lvl>
+    <w:lvl w:ilvl="6">
+      <w:start w:val="1"/>
+      <w:numFmt w:val="decimal"/>
+      <w:isLgl/>
+      <w:lvlText w:val="%1.%2.%3.%4.%5.%6.%7"/>
+      <w:lvlJc w:val="left"/>
+      <w:pPr>
+        <w:ind w:left="3960" w:hanging="1440"/>
+      </w:pPr>
+    </w:lvl>
+    <w:lvl w:ilvl="7">
+      <w:start w:val="1"/>
+      <w:numFmt w:val="decimal"/>
+      <w:isLgl/>
+      <w:lvlText w:val="%1.%2.%3.%4.%5.%6.%7.%8"/>
+      <w:lvlJc w:val="left"/>
+      <w:pPr>
+        <w:ind w:left="4320" w:hanging="1440"/>
+      </w:pPr>
+    </w:lvl>
+    <w:lvl w:ilvl="8">
+      <w:start w:val="1"/>
+      <w:numFmt w:val="decimal"/>
+      <w:isLgl/>
+      <w:lvlText w:val="%1.%2.%3.%4.%5.%6.%7.%8.%9"/>
+      <w:lvlJc w:val="left"/>
+      <w:pPr>
+        <w:ind w:left="4680" w:hanging="1440"/>
+      </w:pPr>
+    </w:lvl>
+  </w:abstractNum>
+  <w:abstractNum w:abstractNumId="34" w15:restartNumberingAfterBreak="0">
     <w:nsid w:val="51974545"/>
     <w:multiLevelType w:val="hybridMultilevel"/>
     <w:tmpl w:val="6096C0CA"/>
@@ -8769,7 +9137,7 @@
       </w:rPr>
     </w:lvl>
   </w:abstractNum>
-  <w:abstractNum w:abstractNumId="33" w15:restartNumberingAfterBreak="0">
+  <w:abstractNum w:abstractNumId="35" w15:restartNumberingAfterBreak="0">
     <w:nsid w:val="55BD6918"/>
     <w:multiLevelType w:val="hybridMultilevel"/>
     <w:tmpl w:val="366E9CDA"/>
@@ -8882,7 +9250,7 @@
       </w:rPr>
     </w:lvl>
   </w:abstractNum>
-  <w:abstractNum w:abstractNumId="34" w15:restartNumberingAfterBreak="0">
+  <w:abstractNum w:abstractNumId="36" w15:restartNumberingAfterBreak="0">
     <w:nsid w:val="5CF72B8D"/>
     <w:multiLevelType w:val="multilevel"/>
     <w:tmpl w:val="D6087602"/>
@@ -9031,7 +9399,7 @@
       </w:rPr>
     </w:lvl>
   </w:abstractNum>
-  <w:abstractNum w:abstractNumId="35" w15:restartNumberingAfterBreak="0">
+  <w:abstractNum w:abstractNumId="37" w15:restartNumberingAfterBreak="0">
     <w:nsid w:val="5E151391"/>
     <w:multiLevelType w:val="multilevel"/>
     <w:tmpl w:val="AD24D6FA"/>
@@ -9180,7 +9548,7 @@
       </w:rPr>
     </w:lvl>
   </w:abstractNum>
-  <w:abstractNum w:abstractNumId="36" w15:restartNumberingAfterBreak="0">
+  <w:abstractNum w:abstractNumId="38" w15:restartNumberingAfterBreak="0">
     <w:nsid w:val="60F72D86"/>
     <w:multiLevelType w:val="multilevel"/>
     <w:tmpl w:val="76AAE06A"/>
@@ -9293,7 +9661,7 @@
       </w:pPr>
     </w:lvl>
   </w:abstractNum>
-  <w:abstractNum w:abstractNumId="37" w15:restartNumberingAfterBreak="0">
+  <w:abstractNum w:abstractNumId="39" w15:restartNumberingAfterBreak="0">
     <w:nsid w:val="623A2489"/>
     <w:multiLevelType w:val="hybridMultilevel"/>
     <w:tmpl w:val="9C3298D4"/>
@@ -9406,7 +9774,93 @@
       </w:rPr>
     </w:lvl>
   </w:abstractNum>
-  <w:abstractNum w:abstractNumId="38" w15:restartNumberingAfterBreak="0">
+  <w:abstractNum w:abstractNumId="40" w15:restartNumberingAfterBreak="0">
+    <w:nsid w:val="68112D74"/>
+    <w:multiLevelType w:val="hybridMultilevel"/>
+    <w:tmpl w:val="F716C93E"/>
+    <w:lvl w:ilvl="0" w:tplc="0419000F">
+      <w:start w:val="1"/>
+      <w:numFmt w:val="decimal"/>
+      <w:lvlText w:val="%1."/>
+      <w:lvlJc w:val="left"/>
+      <w:pPr>
+        <w:ind w:left="720" w:hanging="360"/>
+      </w:pPr>
+    </w:lvl>
+    <w:lvl w:ilvl="1" w:tplc="04190019" w:tentative="1">
+      <w:start w:val="1"/>
+      <w:numFmt w:val="lowerLetter"/>
+      <w:lvlText w:val="%2."/>
+      <w:lvlJc w:val="left"/>
+      <w:pPr>
+        <w:ind w:left="1440" w:hanging="360"/>
+      </w:pPr>
+    </w:lvl>
+    <w:lvl w:ilvl="2" w:tplc="0419001B" w:tentative="1">
+      <w:start w:val="1"/>
+      <w:numFmt w:val="lowerRoman"/>
+      <w:lvlText w:val="%3."/>
+      <w:lvlJc w:val="right"/>
+      <w:pPr>
+        <w:ind w:left="2160" w:hanging="180"/>
+      </w:pPr>
+    </w:lvl>
+    <w:lvl w:ilvl="3" w:tplc="0419000F" w:tentative="1">
+      <w:start w:val="1"/>
+      <w:numFmt w:val="decimal"/>
+      <w:lvlText w:val="%4."/>
+      <w:lvlJc w:val="left"/>
+      <w:pPr>
+        <w:ind w:left="2880" w:hanging="360"/>
+      </w:pPr>
+    </w:lvl>
+    <w:lvl w:ilvl="4" w:tplc="04190019" w:tentative="1">
+      <w:start w:val="1"/>
+      <w:numFmt w:val="lowerLetter"/>
+      <w:lvlText w:val="%5."/>
+      <w:lvlJc w:val="left"/>
+      <w:pPr>
+        <w:ind w:left="3600" w:hanging="360"/>
+      </w:pPr>
+    </w:lvl>
+    <w:lvl w:ilvl="5" w:tplc="0419001B" w:tentative="1">
+      <w:start w:val="1"/>
+      <w:numFmt w:val="lowerRoman"/>
+      <w:lvlText w:val="%6."/>
+      <w:lvlJc w:val="right"/>
+      <w:pPr>
+        <w:ind w:left="4320" w:hanging="180"/>
+      </w:pPr>
+    </w:lvl>
+    <w:lvl w:ilvl="6" w:tplc="0419000F" w:tentative="1">
+      <w:start w:val="1"/>
+      <w:numFmt w:val="decimal"/>
+      <w:lvlText w:val="%7."/>
+      <w:lvlJc w:val="left"/>
+      <w:pPr>
+        <w:ind w:left="5040" w:hanging="360"/>
+      </w:pPr>
+    </w:lvl>
+    <w:lvl w:ilvl="7" w:tplc="04190019" w:tentative="1">
+      <w:start w:val="1"/>
+      <w:numFmt w:val="lowerLetter"/>
+      <w:lvlText w:val="%8."/>
+      <w:lvlJc w:val="left"/>
+      <w:pPr>
+        <w:ind w:left="5760" w:hanging="360"/>
+      </w:pPr>
+    </w:lvl>
+    <w:lvl w:ilvl="8" w:tplc="0419001B" w:tentative="1">
+      <w:start w:val="1"/>
+      <w:numFmt w:val="lowerRoman"/>
+      <w:lvlText w:val="%9."/>
+      <w:lvlJc w:val="right"/>
+      <w:pPr>
+        <w:ind w:left="6480" w:hanging="180"/>
+      </w:pPr>
+    </w:lvl>
+  </w:abstractNum>
+  <w:abstractNum w:abstractNumId="41" w15:restartNumberingAfterBreak="0">
     <w:nsid w:val="6B6A09E2"/>
     <w:multiLevelType w:val="hybridMultilevel"/>
     <w:tmpl w:val="1C10F446"/>
@@ -9519,7 +9973,7 @@
       </w:rPr>
     </w:lvl>
   </w:abstractNum>
-  <w:abstractNum w:abstractNumId="39" w15:restartNumberingAfterBreak="0">
+  <w:abstractNum w:abstractNumId="42" w15:restartNumberingAfterBreak="0">
     <w:nsid w:val="6CF8315A"/>
     <w:multiLevelType w:val="multilevel"/>
     <w:tmpl w:val="32100942"/>
@@ -9632,7 +10086,7 @@
       </w:pPr>
     </w:lvl>
   </w:abstractNum>
-  <w:abstractNum w:abstractNumId="40" w15:restartNumberingAfterBreak="0">
+  <w:abstractNum w:abstractNumId="43" w15:restartNumberingAfterBreak="0">
     <w:nsid w:val="703F69BC"/>
     <w:multiLevelType w:val="multilevel"/>
     <w:tmpl w:val="1BD87950"/>
@@ -9781,7 +10235,7 @@
       </w:rPr>
     </w:lvl>
   </w:abstractNum>
-  <w:abstractNum w:abstractNumId="41" w15:restartNumberingAfterBreak="0">
+  <w:abstractNum w:abstractNumId="44" w15:restartNumberingAfterBreak="0">
     <w:nsid w:val="70D32649"/>
     <w:multiLevelType w:val="hybridMultilevel"/>
     <w:tmpl w:val="44A6F91C"/>
@@ -9870,7 +10324,7 @@
       </w:pPr>
     </w:lvl>
   </w:abstractNum>
-  <w:abstractNum w:abstractNumId="42" w15:restartNumberingAfterBreak="0">
+  <w:abstractNum w:abstractNumId="45" w15:restartNumberingAfterBreak="0">
     <w:nsid w:val="73C171DB"/>
     <w:multiLevelType w:val="multilevel"/>
     <w:tmpl w:val="423AF784"/>
@@ -10019,7 +10473,7 @@
       </w:rPr>
     </w:lvl>
   </w:abstractNum>
-  <w:abstractNum w:abstractNumId="43" w15:restartNumberingAfterBreak="0">
+  <w:abstractNum w:abstractNumId="46" w15:restartNumberingAfterBreak="0">
     <w:nsid w:val="74D44A1A"/>
     <w:multiLevelType w:val="multilevel"/>
     <w:tmpl w:val="48B84C24"/>
@@ -10140,7 +10594,7 @@
       </w:rPr>
     </w:lvl>
   </w:abstractNum>
-  <w:abstractNum w:abstractNumId="44" w15:restartNumberingAfterBreak="0">
+  <w:abstractNum w:abstractNumId="47" w15:restartNumberingAfterBreak="0">
     <w:nsid w:val="78C161FC"/>
     <w:multiLevelType w:val="hybridMultilevel"/>
     <w:tmpl w:val="AF280DB4"/>
@@ -10253,7 +10707,7 @@
       </w:rPr>
     </w:lvl>
   </w:abstractNum>
-  <w:abstractNum w:abstractNumId="45" w15:restartNumberingAfterBreak="0">
+  <w:abstractNum w:abstractNumId="48" w15:restartNumberingAfterBreak="0">
     <w:nsid w:val="78F3513B"/>
     <w:multiLevelType w:val="multilevel"/>
     <w:tmpl w:val="1F4E34A8"/>
@@ -10402,7 +10856,7 @@
       </w:rPr>
     </w:lvl>
   </w:abstractNum>
-  <w:abstractNum w:abstractNumId="46" w15:restartNumberingAfterBreak="0">
+  <w:abstractNum w:abstractNumId="49" w15:restartNumberingAfterBreak="0">
     <w:nsid w:val="7C65081A"/>
     <w:multiLevelType w:val="multilevel"/>
     <w:tmpl w:val="EECCB370"/>
@@ -10552,49 +11006,49 @@
     </w:lvl>
   </w:abstractNum>
   <w:num w:numId="1">
-    <w:abstractNumId w:val="25"/>
+    <w:abstractNumId w:val="26"/>
   </w:num>
   <w:num w:numId="2">
     <w:abstractNumId w:val="14"/>
   </w:num>
   <w:num w:numId="3">
-    <w:abstractNumId w:val="16"/>
+    <w:abstractNumId w:val="17"/>
   </w:num>
   <w:num w:numId="4">
-    <w:abstractNumId w:val="27"/>
+    <w:abstractNumId w:val="28"/>
   </w:num>
   <w:num w:numId="5">
-    <w:abstractNumId w:val="39"/>
+    <w:abstractNumId w:val="42"/>
   </w:num>
   <w:num w:numId="6">
-    <w:abstractNumId w:val="28"/>
+    <w:abstractNumId w:val="29"/>
   </w:num>
   <w:num w:numId="7">
     <w:abstractNumId w:val="6"/>
   </w:num>
   <w:num w:numId="8">
-    <w:abstractNumId w:val="46"/>
+    <w:abstractNumId w:val="49"/>
   </w:num>
   <w:num w:numId="9">
-    <w:abstractNumId w:val="17"/>
+    <w:abstractNumId w:val="18"/>
   </w:num>
   <w:num w:numId="10">
     <w:abstractNumId w:val="12"/>
   </w:num>
   <w:num w:numId="11">
-    <w:abstractNumId w:val="41"/>
+    <w:abstractNumId w:val="44"/>
   </w:num>
   <w:num w:numId="12">
     <w:abstractNumId w:val="8"/>
   </w:num>
   <w:num w:numId="13">
-    <w:abstractNumId w:val="35"/>
+    <w:abstractNumId w:val="37"/>
   </w:num>
   <w:num w:numId="14">
-    <w:abstractNumId w:val="32"/>
+    <w:abstractNumId w:val="34"/>
   </w:num>
   <w:num w:numId="15">
-    <w:abstractNumId w:val="34"/>
+    <w:abstractNumId w:val="36"/>
   </w:num>
   <w:num w:numId="16">
     <w:abstractNumId w:val="7"/>
@@ -10603,16 +11057,16 @@
     <w:abstractNumId w:val="2"/>
   </w:num>
   <w:num w:numId="18">
+    <w:abstractNumId w:val="46"/>
+  </w:num>
+  <w:num w:numId="19">
+    <w:abstractNumId w:val="32"/>
+  </w:num>
+  <w:num w:numId="20">
     <w:abstractNumId w:val="43"/>
   </w:num>
-  <w:num w:numId="19">
+  <w:num w:numId="21">
     <w:abstractNumId w:val="31"/>
-  </w:num>
-  <w:num w:numId="20">
-    <w:abstractNumId w:val="40"/>
-  </w:num>
-  <w:num w:numId="21">
-    <w:abstractNumId w:val="30"/>
   </w:num>
   <w:num w:numId="22">
     <w:abstractNumId w:val="9"/>
@@ -10627,43 +11081,43 @@
     <w:abstractNumId w:val="0"/>
   </w:num>
   <w:num w:numId="26">
+    <w:abstractNumId w:val="22"/>
+  </w:num>
+  <w:num w:numId="27">
+    <w:abstractNumId w:val="38"/>
+  </w:num>
+  <w:num w:numId="28">
     <w:abstractNumId w:val="21"/>
   </w:num>
-  <w:num w:numId="27">
-    <w:abstractNumId w:val="36"/>
-  </w:num>
-  <w:num w:numId="28">
-    <w:abstractNumId w:val="20"/>
-  </w:num>
   <w:num w:numId="29">
-    <w:abstractNumId w:val="18"/>
+    <w:abstractNumId w:val="19"/>
   </w:num>
   <w:num w:numId="30">
     <w:abstractNumId w:val="10"/>
   </w:num>
   <w:num w:numId="31">
-    <w:abstractNumId w:val="44"/>
+    <w:abstractNumId w:val="47"/>
   </w:num>
   <w:num w:numId="32">
     <w:abstractNumId w:val="4"/>
   </w:num>
   <w:num w:numId="33">
-    <w:abstractNumId w:val="33"/>
+    <w:abstractNumId w:val="35"/>
   </w:num>
   <w:num w:numId="34">
-    <w:abstractNumId w:val="38"/>
+    <w:abstractNumId w:val="41"/>
   </w:num>
   <w:num w:numId="35">
-    <w:abstractNumId w:val="45"/>
+    <w:abstractNumId w:val="48"/>
   </w:num>
   <w:num w:numId="36">
     <w:abstractNumId w:val="5"/>
   </w:num>
   <w:num w:numId="37">
-    <w:abstractNumId w:val="29"/>
+    <w:abstractNumId w:val="30"/>
   </w:num>
   <w:num w:numId="38">
-    <w:abstractNumId w:val="42"/>
+    <w:abstractNumId w:val="45"/>
   </w:num>
   <w:num w:numId="39">
     <w:abstractNumId w:val="1"/>
@@ -10672,31 +11126,67 @@
     <w:abstractNumId w:val="13"/>
   </w:num>
   <w:num w:numId="41">
-    <w:abstractNumId w:val="24"/>
+    <w:abstractNumId w:val="25"/>
   </w:num>
   <w:num w:numId="42">
-    <w:abstractNumId w:val="19"/>
+    <w:abstractNumId w:val="20"/>
   </w:num>
   <w:num w:numId="43">
-    <w:abstractNumId w:val="26"/>
+    <w:abstractNumId w:val="27"/>
   </w:num>
   <w:num w:numId="44">
-    <w:abstractNumId w:val="22"/>
+    <w:abstractNumId w:val="23"/>
   </w:num>
   <w:num w:numId="45">
     <w:abstractNumId w:val="3"/>
   </w:num>
   <w:num w:numId="46">
-    <w:abstractNumId w:val="37"/>
+    <w:abstractNumId w:val="39"/>
   </w:num>
   <w:num w:numId="47">
-    <w:abstractNumId w:val="23"/>
+    <w:abstractNumId w:val="24"/>
+  </w:num>
+  <w:num w:numId="48">
+    <w:abstractNumId w:val="33"/>
+    <w:lvlOverride w:ilvl="0">
+      <w:startOverride w:val="1"/>
+    </w:lvlOverride>
+    <w:lvlOverride w:ilvl="1">
+      <w:startOverride w:val="1"/>
+    </w:lvlOverride>
+    <w:lvlOverride w:ilvl="2">
+      <w:startOverride w:val="1"/>
+    </w:lvlOverride>
+    <w:lvlOverride w:ilvl="3">
+      <w:startOverride w:val="1"/>
+    </w:lvlOverride>
+    <w:lvlOverride w:ilvl="4">
+      <w:startOverride w:val="1"/>
+    </w:lvlOverride>
+    <w:lvlOverride w:ilvl="5">
+      <w:startOverride w:val="1"/>
+    </w:lvlOverride>
+    <w:lvlOverride w:ilvl="6">
+      <w:startOverride w:val="1"/>
+    </w:lvlOverride>
+    <w:lvlOverride w:ilvl="7">
+      <w:startOverride w:val="1"/>
+    </w:lvlOverride>
+    <w:lvlOverride w:ilvl="8">
+      <w:startOverride w:val="1"/>
+    </w:lvlOverride>
+  </w:num>
+  <w:num w:numId="49">
+    <w:abstractNumId w:val="16"/>
+  </w:num>
+  <w:num w:numId="50">
+    <w:abstractNumId w:val="40"/>
   </w:num>
 </w:numbering>
 </file>
 
 <file path=word/styles.xml><?xml version="1.0" encoding="utf-8"?>
-<w:styles xmlns:mc="http://schemas.openxmlformats.org/markup-compatibility/2006" xmlns:r="http://schemas.openxmlformats.org/officeDocument/2006/relationships" xmlns:w="http://schemas.openxmlformats.org/wordprocessingml/2006/main" xmlns:w14="http://schemas.microsoft.com/office/word/2010/wordml" xmlns:w15="http://schemas.microsoft.com/office/word/2012/wordml" xmlns:w16cex="http://schemas.microsoft.com/office/word/2018/wordml/cex" xmlns:w16cid="http://schemas.microsoft.com/office/word/2016/wordml/cid" xmlns:w16="http://schemas.microsoft.com/office/word/2018/wordml" xmlns:w16sdtdh="http://schemas.microsoft.com/office/word/2020/wordml/sdtdatahash" xmlns:w16se="http://schemas.microsoft.com/office/word/2015/wordml/symex" mc:Ignorable="w14 w15 w16se w16cid w16 w16cex w16sdtdh">
+<w:styles xmlns:mc="http://schemas.openxmlformats.org/markup-compatibility/2006" xmlns:r="http://schemas.openxmlformats.org/officeDocument/2006/relationships" xmlns:w="http://schemas.openxmlformats.org/wordprocessingml/2006/main" xmlns:w14="http://schemas.microsoft.com/office/word/2010/wordml" xmlns:w15="http://schemas.microsoft.com/office/word/2012/wordml" xmlns:w16se="http://schemas.microsoft.com/office/word/2015/wordml/symex" mc:Ignorable="w14 w15 w16se">
   <w:docDefaults>
     <w:rPrDefault>
       <w:rPr>
@@ -10712,7 +11202,7 @@
       </w:pPr>
     </w:pPrDefault>
   </w:docDefaults>
-  <w:latentStyles w:defLockedState="0" w:defUIPriority="99" w:defSemiHidden="0" w:defUnhideWhenUsed="0" w:defQFormat="0" w:count="376">
+  <w:latentStyles w:defLockedState="0" w:defUIPriority="99" w:defSemiHidden="0" w:defUnhideWhenUsed="0" w:defQFormat="0" w:count="371">
     <w:lsdException w:name="Normal" w:uiPriority="0" w:qFormat="1"/>
     <w:lsdException w:name="heading 1" w:uiPriority="9" w:qFormat="1"/>
     <w:lsdException w:name="heading 2" w:semiHidden="1" w:uiPriority="9" w:unhideWhenUsed="1" w:qFormat="1"/>
@@ -10818,6 +11308,7 @@
     <w:lsdException w:name="HTML Sample" w:semiHidden="1" w:unhideWhenUsed="1"/>
     <w:lsdException w:name="HTML Typewriter" w:semiHidden="1" w:unhideWhenUsed="1"/>
     <w:lsdException w:name="HTML Variable" w:semiHidden="1" w:unhideWhenUsed="1"/>
+    <w:lsdException w:name="Normal Table" w:semiHidden="1" w:unhideWhenUsed="1"/>
     <w:lsdException w:name="annotation subject" w:semiHidden="1" w:unhideWhenUsed="1"/>
     <w:lsdException w:name="No List" w:semiHidden="1" w:unhideWhenUsed="1"/>
     <w:lsdException w:name="Outline List 1" w:semiHidden="1" w:unhideWhenUsed="1"/>
@@ -10860,8 +11351,11 @@
     <w:lsdException w:name="Table Contemporary" w:semiHidden="1" w:unhideWhenUsed="1"/>
     <w:lsdException w:name="Table Elegant" w:semiHidden="1" w:unhideWhenUsed="1"/>
     <w:lsdException w:name="Table Professional" w:semiHidden="1" w:unhideWhenUsed="1"/>
+    <w:lsdException w:name="Table Subtle 1" w:semiHidden="1" w:unhideWhenUsed="1"/>
     <w:lsdException w:name="Table Subtle 2" w:semiHidden="1" w:unhideWhenUsed="1"/>
     <w:lsdException w:name="Table Web 1" w:semiHidden="1" w:unhideWhenUsed="1"/>
+    <w:lsdException w:name="Table Web 2" w:semiHidden="1" w:unhideWhenUsed="1"/>
+    <w:lsdException w:name="Table Web 3" w:semiHidden="1" w:unhideWhenUsed="1"/>
     <w:lsdException w:name="Balloon Text" w:semiHidden="1" w:unhideWhenUsed="1"/>
     <w:lsdException w:name="Table Grid" w:uiPriority="39"/>
     <w:lsdException w:name="Table Theme" w:semiHidden="1" w:unhideWhenUsed="1"/>
@@ -11080,11 +11574,6 @@
     <w:lsdException w:name="List Table 5 Dark Accent 6" w:uiPriority="50"/>
     <w:lsdException w:name="List Table 6 Colorful Accent 6" w:uiPriority="51"/>
     <w:lsdException w:name="List Table 7 Colorful Accent 6" w:uiPriority="52"/>
-    <w:lsdException w:name="Mention" w:semiHidden="1" w:unhideWhenUsed="1"/>
-    <w:lsdException w:name="Smart Hyperlink" w:semiHidden="1" w:unhideWhenUsed="1"/>
-    <w:lsdException w:name="Hashtag" w:semiHidden="1" w:unhideWhenUsed="1"/>
-    <w:lsdException w:name="Unresolved Mention" w:semiHidden="1" w:unhideWhenUsed="1"/>
-    <w:lsdException w:name="Smart Link" w:semiHidden="1" w:unhideWhenUsed="1"/>
   </w:latentStyles>
   <w:style w:type="paragraph" w:default="1" w:styleId="a">
     <w:name w:val="Normal"/>
@@ -11704,7 +12193,7 @@
 </file>
 
 <file path=customXml/itemProps1.xml><?xml version="1.0" encoding="utf-8"?>
-<ds:datastoreItem xmlns:ds="http://schemas.openxmlformats.org/officeDocument/2006/customXml" ds:itemID="{C742CB4C-4FF9-4C96-9235-7AAC64A0DF01}">
+<ds:datastoreItem xmlns:ds="http://schemas.openxmlformats.org/officeDocument/2006/customXml" ds:itemID="{2DECFC78-75C8-4914-B5B1-9AC9836EB9F4}">
   <ds:schemaRefs>
     <ds:schemaRef ds:uri="http://schemas.openxmlformats.org/officeDocument/2006/bibliography"/>
   </ds:schemaRefs>

</xml_diff>